<commit_message>
Auto commit (2026-10-06 20:24) — 2 changes
Claude Code 세션 종료 시 자동 커밋.

Co-Authored-By: Claude <noreply@anthropic.com>
</commit_message>
<xml_diff>
--- a/projects/리메이크 러프 기획안 11종_v3.docx
+++ b/projects/리메이크 러프 기획안 11종_v3.docx
@@ -250,7 +250,7 @@
           <w:b/>
           <w:sz w:val="21"/>
         </w:rPr>
-        <w:t>He Chose the Wrong Princess</w:t>
+        <w:t>Then Jump, Sister</w:t>
       </w:r>
     </w:p>
     <w:p>
@@ -4320,7 +4320,7 @@
           <w:color w:val="1F3A5F"/>
           <w:sz w:val="34"/>
         </w:rPr>
-        <w:t>[T1] He Chose the Wrong Princess</w:t>
+        <w:t>[T1] Then Jump, Sister</w:t>
       </w:r>
     </w:p>
     <w:p>
@@ -4511,7 +4511,7 @@
           <w:b w:val="0"/>
           <w:sz w:val="21"/>
         </w:rPr>
-        <w:t>자신을 살린 빛나는 소녀를 찾아, 엘프 공주의 가디언으로 숨어든 이웃 나라 왕 이선. 빛 없는 공주 올리비아는 이복동생 제나의 이름을 부른 이선을 먼저 버리고, 눈이 멀었다는 왕과의 혼인을 택한다. 하지만 이선은 자신을 살리다 빛을 잃은 소녀가 올리비아인 줄 모른 채, 제나를 그 소녀라 믿고 올리비아를 짓밟는다.</w:t>
+        <w:t>어린 날 독에 쓰러진 소년을 살리고 백금발을 잃어 '재앙의 흑발'로 멸시받는 엘프 공주가, 마법 염색으로 백금발을 꾸민 이복동생을 그 소녀로 믿는 운명의 짝을 먼저 버리고, 동생이 죽어도 싫다던 눈먼 왕과의 혼인을 스스로 거래해, 끝내 백금발로 깨어나 그 왕의 왕비가 되는 이야기.</w:t>
       </w:r>
     </w:p>
     <w:p>
@@ -4542,7 +4542,7 @@
           <w:b w:val="0"/>
           <w:sz w:val="21"/>
         </w:rPr>
-        <w:t>1. 짓밟혀도 매달리지 않고 먼저 버리고 판을 뒤집는 걸크러시 여주 ㅡ&gt; 양산형 전개를 깨는 반응</w:t>
+        <w:t>1. 죽겠다며 떼쓰는 동생을 진짜로 밀어 버리는 걸크러시 여주, 양산형 전개를 깨는 반응</w:t>
       </w:r>
     </w:p>
     <w:p>
@@ -4557,7 +4557,7 @@
           <w:b w:val="0"/>
           <w:sz w:val="21"/>
         </w:rPr>
-        <w:t>2. 자기를 살리다 빛을 잃은 소녀를 곁에 두고도 빛이 없다며 짓밟는 짝 ㅡ&gt; 남주만 모르는 정보 비대칭, 거절당한 짝의 후회물 정석</w:t>
+        <w:t>2. 염색한 가짜를 구원자로 믿고 진짜 짝을 짓밟는 남자, 거절당한 짝의 후회물 정석</w:t>
       </w:r>
     </w:p>
     <w:p>
@@ -4572,7 +4572,7 @@
           <w:b w:val="0"/>
           <w:sz w:val="21"/>
         </w:rPr>
-        <w:t>3. 눈이 멀었다고 소문난 정혼자가 진짜 남주 ㅡ&gt; 히든 아이덴티티 역전</w:t>
+        <w:t>3. 눈이 멀었다는 소문의 정혼자가 진짜 남주인 숨겨진 정체</w:t>
       </w:r>
     </w:p>
     <w:p>
@@ -4587,7 +4587,7 @@
           <w:b w:val="0"/>
           <w:sz w:val="21"/>
         </w:rPr>
-        <w:t>4. 웨어울프 ㅡ&gt; 엘프, 은빛 ㅡ&gt; 별빛 치환</w:t>
+        <w:t>4. 웨어울프 ㅡ&gt; 엘프 치환 (백금발 = 순혈의 상징, 흑발 = 재앙)</w:t>
       </w:r>
     </w:p>
     <w:p>
@@ -4632,7 +4632,7 @@
           <w:b w:val="0"/>
           <w:sz w:val="21"/>
         </w:rPr>
-        <w:t>몸에서 별빛이 나는 엘프 왕가에서 혼자 빛을 잃어 '빛 없는 공주'라 불리는 제1공주 올리비아 무어. 어릴 적 숲에서 돌아온 날 빛이 꺼진 뒤로 올리비아는 밤이면 등불 없이 한 걸음도 못 걷는다. 가디언을 고르는 밤, 별빛이 가장 밝은 이복동생 제나가 언니한테 필요한 건 가디언이 아니라 등불 들 하인이라고 비웃자 후보들이 따라 웃는다. 그 가운데 웃지 않는 후보는 어린 날 캄캄한 숲에서 빛나는 손으로 자기를 살린 소녀를 찾아, 신분을 숨기고 온 이웃 나라 왕 이선이다. 그래서 이선은 처음부터 제나만 보고, 그 소녀가 올리비아라는 건 모른다.</w:t>
+        <w:t>연회장 테라스 난간에 올라선 엘프 왕국 둘째 공주 제나가, 눈먼 밤의 왕에게 시집갈 바엔 뛰어내리겠다고 울부짖는다. 흑발의 제1공주 올리비아가 걸어 나온다. 어린 날 독에 쓰러진 소년의 독을 대신 빨아내다 백금발이 흑발로 변해, '재앙의 흑발'로 불려 온 공주다. 「죽고 싶어? 그럼 죽어.」 올리비아는 제나의 목덜미를 잡아 난간 밖으로 밀어 버린다. 떨어지던 제나를 국왕이 뻗은 정령의 바람이 겨우 받아 올린다. 올리비아가 아버지를 돌아본다. 「쟤가 죽어도 싫다는 그 혼인, 내가 갈게요. 값은 제대로 치르세요.」</w:t>
       </w:r>
     </w:p>
     <w:p>
@@ -4646,7 +4646,7 @@
           <w:b w:val="0"/>
           <w:sz w:val="21"/>
         </w:rPr>
-        <w:t>올리비아가 이선 앞에 서서 자기 등불을 내민다. 「들어. 오늘부터 네가 내 등불이야.」 이선이 등불은 받지도 않고 제나 쪽만 보자, 올리비아가 문을 가리킨다. 「싫으면 나가.」 그 소녀를 찾기 전엔 못 떠나는 이선이 이를 악물고 등불을 받는 순간, 손잡이 위에서 겹친 두 손바닥에 같은 별이 떠오른다. 평생 한 사람과만 나누는 엘프의 짝별이다. 숲의 그 소녀는 빛이 났다며 짝별을 믿지 않는 이선은, 별이 뜬 왼손에 검은 장갑을 낀다.</w:t>
+        <w:t>3년 전, 올리비아는 가디언으로 신분을 숨긴 이웃 나라 왕 캐스피언을 골랐다. 손을 잡는 순간 두 손바닥에 짝의 표식인 붉은 덩굴 각인이 피었지만, 캐스피언은 자기를 살린 백금발 소녀가 흑발 공주일 리 없다며 검은 장갑으로 각인을 덮었다. 그 소녀가 올리비아라는 걸, 제나의 백금발이 매일 바르는 마법 염색약이라는 걸 그는 모른다. 그리고 어젯밤, 3년 동안 그녀의 등불을 들던 캐스피언이 꺼진 복도에서 그녀에게 입을 맞추며 다른 이름을 불렀다. 「제나.」</w:t>
       </w:r>
     </w:p>
     <w:p>
@@ -4675,21 +4675,7 @@
           <w:b w:val="0"/>
           <w:sz w:val="21"/>
         </w:rPr>
-        <w:t>그날부터 3년 동안 이선은 장갑 낀 손으로 밤마다 올리비아 앞에서 등불을 들고, 올리비아는 그게 사랑이라 믿는다. 어느 밤 복도에서 바람에 등불이 꺼지고 앞이 안 보이는 올리비아가 이선의 팔을 붙잡자, 숲의 그 소녀를 떠올린 이선은 어둠 속에서 올리비아를 끌어안고 입을 맞추며 그 소녀라 믿는 제나의 이름을 부른다. 다음 날 아침, 궁정 사람들이 다 모인 자리에서 올리비아는 이선의 장갑을 벗겨 그가 3년 동안 숨겨 온 짝별을 드러내고, 단검으로 자기 손바닥의 짝별을 긋는다. 「너 같은 짝, 내가 먼저 버린다.」</w:t>
-      </w:r>
-    </w:p>
-    <w:p>
-      <w:pPr>
-        <w:keepNext w:val="0"/>
-        <w:spacing w:after="120" w:before="0" w:line="331" w:lineRule="auto"/>
-      </w:pPr>
-      <w:r>
-        <w:rPr>
-          <w:rFonts w:ascii="맑은 고딕" w:hAnsi="맑은 고딕" w:eastAsia="맑은 고딕" w:cs="맑은 고딕"/>
-          <w:b w:val="0"/>
-          <w:sz w:val="21"/>
-        </w:rPr>
-        <w:t>석 달 뒤, 제나는 작은 병을 입에 대고, 눈이 멀었다는 소문이 도는 밤의 왕국 왕 가브리엘에게 자기를 보내면 이 독을 마시겠다고 운다. 아버지인 국왕이 밤의 왕국과 한 약속은 못 물린다고 하고 새엄마인 왕비 다이앤이 딸을 끌어안고 울자, 제나는 짝까지 버린 빛 없는 언니가 눈먼 왕한테 딱 맞는다며 올리비아를 가리킨다. 올리비아는 제나의 병을 빼앗아 단숨에 들이켜고, 꿀물이라며 빈 병을 내던진다. 「눈먼 왕이든 뭐든, 그 왕비 자리는 내가 가질게.」</w:t>
+        <w:t>다음 날 아침 궁정이 다 모인 연회장, 올리비아가 캐스피언의 장갑을 잡아 벗긴다. 숨겨 온 붉은 덩굴 각인이 모두 앞에 드러나고, 올리비아는 단검으로 자기 손바닥의 각인을 그어 찢는다. 「너 같은 짝, 내가 먼저 버린다.」 피가 떨어지는 손으로 올리비아는 국왕 앞에 서서, 제나 대신 밤의 왕국 왕비가 되겠다고 궁정 앞에서 선언한다. 귀족들은 재앙의 흑발이 눈먼 왕에게는 딱 맞는 짝이라고 웃고, 제나는 캐스피언의 팔에 매달려 언니가 자기를 죽이려 했다고 운다. 캐스피언은 올리비아의 피 흐르는 손을 내려다보며 차갑게 말한다. 「어디 가나 보자. 일주일도 못 버티고 돌아올 테니.」</w:t>
       </w:r>
     </w:p>
     <w:p>
@@ -4718,35 +4704,7 @@
           <w:b w:val="0"/>
           <w:sz w:val="21"/>
         </w:rPr>
-        <w:t>올리비아가 왕비 자리를 가지겠다고 나선 그 밤, 이선은 자기 나라에서 온 부관에게서 제나의 생일에 줄 별 조각을 받아 든다. 백 년에 한 번 하늘에서 떨어진다는, 영원히 꺼지지 않는 빛이다. 그 빛 앞에서 이선은 어린 날의 숲을 떠올린다.</w:t>
-      </w:r>
-    </w:p>
-    <w:p>
-      <w:pPr>
-        <w:keepNext w:val="0"/>
-        <w:spacing w:after="120" w:before="0" w:line="331" w:lineRule="auto"/>
-      </w:pPr>
-      <w:r>
-        <w:rPr>
-          <w:rFonts w:ascii="맑은 고딕" w:hAnsi="맑은 고딕" w:eastAsia="맑은 고딕" w:cs="맑은 고딕"/>
-          <w:b w:val="0"/>
-          <w:sz w:val="21"/>
-        </w:rPr>
-        <w:t>독화살을 맞고 캄캄한 숲에 쓰러진 어린 이선에게 작은 소녀가 다가와 빛나는 손을 상처에 댔다. 독이 빠지자 소녀는 그 손의 빛으로 길을 비추며 이선을 숲 밖까지 데려갔고, 이름을 묻기도 전에 소녀를 찾는 뿔피리 소리를 따라 달려가 버렸다. 그날 밤 왕궁으로 돌아온 어린 올리비아의 몸에서는 별빛이 꺼져 있었다. 이선은 지금도 그 소녀가 올리비아인 줄 모르고, 올리비아도 그 소년이 이선인 줄 모른다.</w:t>
-      </w:r>
-    </w:p>
-    <w:p>
-      <w:pPr>
-        <w:keepNext w:val="0"/>
-        <w:spacing w:after="120" w:before="0" w:line="331" w:lineRule="auto"/>
-      </w:pPr>
-      <w:r>
-        <w:rPr>
-          <w:rFonts w:ascii="맑은 고딕" w:hAnsi="맑은 고딕" w:eastAsia="맑은 고딕" w:cs="맑은 고딕"/>
-          <w:b w:val="0"/>
-          <w:sz w:val="21"/>
-        </w:rPr>
-        <w:t>그때 마구간 쪽으로 가는 등불 하나를 본 이선은, 그 숲에서처럼 자기도 모르게 그 빛을 따라간다. 등불 아래서 올리비아가 밤의 왕국까지 타고 갈 흰 말의 갈기에 혼례 리본을 땋고 있다. 이선이 정말 갈 생각도 없으면서 왜 이러냐고 비웃자, 올리비아가 마지막 리본을 묶으며 말한다. 「착각하지 마. 다음 달이면 나, 밤의 왕국 왕비야.」</w:t>
+        <w:t>그날 밤 캐스피언은 부관이 가져온, 영원히 꺼지지 않는 정령 보석을 제나의 생일 선물로 받아 든다. 어린 날 숲에서 독에 쓰러졌을 때 백금발 소녀가 입으로 독을 빨아냈다. 흐려지는 눈으로 본 마지막 모습은 백금발이었고, 그 소녀의 머리가 검게 변하는 순간을 그는 보지 못했다. 다음 날 마구간, 올리비아는 밤의 왕국으로 타고 갈 흰 말의 갈기에 혼례 리본을 땋고 있다. 따라온 캐스피언이 갈 생각도 없으면서 쇼하지 말라고 비웃자, 올리비아는 마지막 리본을 꽉 묶는다. 「착각하지 마. 다음 달이면 나, 밤의 왕국 왕비야.」</w:t>
       </w:r>
     </w:p>
     <w:p>
@@ -4775,35 +4733,7 @@
           <w:b w:val="0"/>
           <w:sz w:val="21"/>
         </w:rPr>
-        <w:t>이선의 뒤를 밟아 온 제나가 마구간에 들어서더니, 눈먼 왕은 보지도 못할 흰 말이니 자기가 타겠다고 한다.</w:t>
-      </w:r>
-    </w:p>
-    <w:p>
-      <w:pPr>
-        <w:keepNext w:val="0"/>
-        <w:spacing w:after="120" w:before="0" w:line="331" w:lineRule="auto"/>
-      </w:pPr>
-      <w:r>
-        <w:rPr>
-          <w:rFonts w:ascii="맑은 고딕" w:hAnsi="맑은 고딕" w:eastAsia="맑은 고딕" w:cs="맑은 고딕"/>
-          <w:b w:val="0"/>
-          <w:sz w:val="21"/>
-        </w:rPr>
-        <w:t>어린 시절, 제나는 올리비아의 조랑말에서 일부러 떨어진 뒤 언니가 밀었다고 울었다. 다이앤은 안 밀었다고 우는 올리비아를 믿지 않고 조랑말을 제나에게 줬다. 그날부터 올리비아의 것은 제나가 울기만 하면 제나의 것이 됐다.</w:t>
-      </w:r>
-    </w:p>
-    <w:p>
-      <w:pPr>
-        <w:keepNext w:val="0"/>
-        <w:spacing w:after="120" w:before="0" w:line="331" w:lineRule="auto"/>
-      </w:pPr>
-      <w:r>
-        <w:rPr>
-          <w:rFonts w:ascii="맑은 고딕" w:hAnsi="맑은 고딕" w:eastAsia="맑은 고딕" w:cs="맑은 고딕"/>
-          <w:b w:val="0"/>
-          <w:sz w:val="21"/>
-        </w:rPr>
-        <w:t>이번에는 이선까지 흰 말은 별빛이 나는 제나 님께 어울린다며 고삐를 제나에게 넘기고, 소란에 궁정 사람들이 마구간 앞으로 몰려든다. 제나가 그 고삐를 올리비아 앞에 내던진다. 「언니가 끌어. 다들 보는 앞에서, 마부처럼.」</w:t>
+        <w:t>그때 제나가 들어와, 눈먼 왕은 말 색도 못 볼 테니 그 흰 말은 백금발인 자기한테 어울린다고 조른다. 캐스피언은 올리비아가 쥐고 있던 고삐를 빼앗아 제나 손에 쥐여 준다. 마구간 앞에 궁정 사람들이 몰려들자, 제나는 고삐를 올리비아 발밑에 던지고 웃는다. 「언니가 끌어. 마부처럼.」 올리비아는 고삐를 주워 캐스피언의 가슴에 던진다. 「네가 끌어. 3년 동안 내 등불 들던 손이잖아.」 이웃 나라 왕이 마부 취급을 당하자 웃음이 터지고, 망신당한 제나는 올리비아가 들고 온 등불을 낚아채 마른 짚더미에 내던진다.</w:t>
       </w:r>
     </w:p>
     <w:p>
@@ -4832,7 +4762,7 @@
           <w:b w:val="0"/>
           <w:sz w:val="21"/>
         </w:rPr>
-        <w:t>궁정 사람들이 숨을 죽인 가운데 고삐를 주워 든 올리비아는, 그 고삐를 이선의 손에 쥐여 준다. 「네가 끌어. 3년 동안 내 등불 들던 손이잖아.」 구경하던 사람들 사이에서 웃음이 터지고, 얼굴이 굳은 이선은 말없이 흰 말을 끌고 밖으로 나간다. 그 사이 웃음거리가 된 제나가 올리비아의 등불을 낚아채 짚더미에 던지고, 등을 돌리고 있던 이선은 그 순간을 보지 못한다. 불길이 순식간에 지붕까지 번져 이선이 다시 뛰어들었을 때, 올리비아는 쓰러진 기둥에 다리가 깔려 있고 제나는 불길 저편에서 울부짖는다. 지붕이 내려앉기 전에 이선이 안고 나갈 수 있는 사람은 하나뿐이다. 올리비아는 살려 달라는 말 대신 이선을 똑바로 본다. 「누구한테 가는지, 내가 똑똑히 볼 거야.」</w:t>
+        <w:t>불길이 순식간에 마구간 지붕까지 번진다. 쓰러진 기둥에 올리비아의 다리가 깔리고, 반대편 칸에서는 제나가 머리를 감싸 쥐고 비명을 지른다. 불 속으로 뛰어든 캐스피언 앞에서 지붕이 무너지며 길이 하나만 남는다. 둘 중 한 사람만 안고 나갈 수 있다. 올리비아는 살려 달라는 말 대신 캐스피언의 눈을 똑바로 본다. 「누구한테 가는지, 내가 똑똑히 볼 거야.」 캐스피언은 그 눈을 피해 제나를 안아 들고, 불길 밖으로 달려 나간다.</w:t>
       </w:r>
     </w:p>
     <w:p>
@@ -4861,35 +4791,7 @@
           <w:b w:val="0"/>
           <w:sz w:val="21"/>
         </w:rPr>
-        <w:t>이선은 올리비아의 눈을 피해 제나를 안아 들고 불 밖으로 뛴다. 등 뒤에서 지붕이 올리비아 위로 무너지는 순간, 마구간 한가운데서 하얀 별빛이 터져 나와 불길을 한 번에 꺼 버린다. 돌아본 이선은 잿더미 위에 선 올리비아의 눈과 살갗에서 별빛이 쏟아지는 걸 본다. 숲에서 자기를 끌고 나가던 그 손의 빛과 똑같은 빛이다.</w:t>
-      </w:r>
-    </w:p>
-    <w:p>
-      <w:pPr>
-        <w:keepNext w:val="0"/>
-        <w:spacing w:after="120" w:before="0" w:line="331" w:lineRule="auto"/>
-      </w:pPr>
-      <w:r>
-        <w:rPr>
-          <w:rFonts w:ascii="맑은 고딕" w:hAnsi="맑은 고딕" w:eastAsia="맑은 고딕" w:cs="맑은 고딕"/>
-          <w:b w:val="0"/>
-          <w:sz w:val="21"/>
-        </w:rPr>
-        <w:t>빛이 꺼지며 올리비아가 쓰러지자 이선이 달려가 손을 내밀지만, 올리비아는 그 손을 쳐 내고 혼자 일어선다. 그때 제나가 소매 끝만 그을린 팔을 감싸 쥐고 언니가 등불을 던져 자기를 태우려 했다고 울자, 이선은 방금 본 빛을 잘못 본 것이라 여기고, 제나의 화상만큼 올리비아의 손을 태우게 하겠다고 한다.</w:t>
-      </w:r>
-    </w:p>
-    <w:p>
-      <w:pPr>
-        <w:keepNext w:val="0"/>
-        <w:spacing w:after="120" w:before="0" w:line="331" w:lineRule="auto"/>
-      </w:pPr>
-      <w:r>
-        <w:rPr>
-          <w:rFonts w:ascii="맑은 고딕" w:hAnsi="맑은 고딕" w:eastAsia="맑은 고딕" w:cs="맑은 고딕"/>
-          <w:b w:val="0"/>
-          <w:sz w:val="21"/>
-        </w:rPr>
-        <w:t>같은 시각 밤의 왕국 성, 소문대로 검은 비단으로 눈을 가린 왕 가브리엘이 신부 될 올리비아가 불 속에 홀로 남겨졌다는 보고를 받는다. 눈가리개를 풀어 멀쩡한 두 눈을 드러낸 가브리엘이 말한다. 「말 준비해. 내 왕비는 내가 데려온다.」</w:t>
+        <w:t>지붕이 올리비아 위로 내려앉는 순간, 그녀의 몸에서 은빛 정령력이 터져 나와 불길을 통째로 삼킨다. 잿더미 위에 선 올리비아의 흑발이 한순간 눈부신 백금발로 빛났다가 다시 검게 가라앉는다. 밖에서는 불의 열기에 제나의 염색약이 녹아, 백금발 사이로 탁한 갈색이 줄줄 흘러내린다. 두 장면을 다 본 캐스피언은 연기 때문에 잘못 봤다며 고개를 돌리고, 제나의 머리를 망토로 덮어 준다. 같은 시각 밤의 왕국, 검은 비단으로 눈을 가린 왕 가브리엘이 신부가 불길에 갇혔다는 보고를 받는다. 가브리엘이 눈가리개를 풀자 서늘하게 멀쩡한 두 눈이 드러난다. 「말 준비해. 내 왕비는 내가 데려온다.」</w:t>
       </w:r>
     </w:p>
     <w:p>
@@ -4918,21 +4820,7 @@
           <w:b w:val="0"/>
           <w:sz w:val="21"/>
         </w:rPr>
-        <w:t>가브리엘이 사흘 밤낮 말을 달리는 사이, 왕궁에서는 제나의 생일 연회가 열린다. 하객들은 이선이 빛 없는 올리비아 대신 별빛이 가장 밝은 제나 곁에 서는 게 당연하다며 제나를 치켜세우고, 다리를 절며 들어선 올리비아를 두고는 빛도 없는 게 마구간에 불을 질러 동생까지 태웠다고 수군거린다. 마구간 위로 솟은 별빛을 사람들은 불길로만 알았고, 그 빛이 올리비아에게서 나온 걸 본 사람은 이선뿐이다.</w:t>
-      </w:r>
-    </w:p>
-    <w:p>
-      <w:pPr>
-        <w:keepNext w:val="0"/>
-        <w:spacing w:after="120" w:before="0" w:line="331" w:lineRule="auto"/>
-      </w:pPr>
-      <w:r>
-        <w:rPr>
-          <w:rFonts w:ascii="맑은 고딕" w:hAnsi="맑은 고딕" w:eastAsia="맑은 고딕" w:cs="맑은 고딕"/>
-          <w:b w:val="0"/>
-          <w:sz w:val="21"/>
-        </w:rPr>
-        <w:t>이선이 제나의 손에 별 조각을 올려 주자 하객들이 탄성을 지르고, 이선의 부관이 올리비아 앞에 작은 유리병 하나를 들어 보인다. 올리비아의 친어머니인 돌아가신 왕비가 빛 없는 딸에게 남긴 마지막 별빛을 담은 병으로, 제나가 올리비아의 혼례 짐에서 몰래 빼내 온 것이다. 부관은 이선의 명이라며, 제나에게 사과하고 기름이 다 탈 때까지 불붙은 유리 등불을 맨손으로 감싸 들고 있으면 병을 내주겠다고 한다. 제나가 웃는다. 「빛 하나 못 내는 언니가, 오늘은 내 등불 들고 서 있어.」</w:t>
+        <w:t>사흘 뒤 제나의 생일 연회, 다리를 절며 들어선 올리비아를 하객들이 방화범이라 손가락질한다. 캐스피언은 꺼지지 않는 정령 보석을 제나 목에 걸어 주고, 하객들은 진짜 구원자에게 어울리는 선물이라며 박수를 친다. 그때 제나가 작은 유리병 하나를 꺼내 흔든다. 올리비아의 혼례 짐에서 몰래 빼낸, 어머니가 숨을 거두며 남긴 마지막 정령수다. 올리비아가 돌려 달라고 다가서자 캐스피언이 막아선다. 제나에게 사과하고, 불붙은 유리 등불을 맨손으로 감싸 쥔 채 불이 다 꺼질 때까지 버티면 병을 돌려주겠다고 한다. 제나가 등불을 내밀며 웃는다. 「오늘도 내 등불 들고 서 있어 봐.」</w:t>
       </w:r>
     </w:p>
     <w:p>
@@ -4961,21 +4849,7 @@
           <w:b w:val="0"/>
           <w:sz w:val="21"/>
         </w:rPr>
-        <w:t>올리비아는 등불을 내민 부관이 아니라 이선을 본다. 「들게. 대신 불은 네가 붙여.」 하객들의 눈이 모두 쏠리자, 이선은 3년 동안 올리비아의 등불을 들던 그 장갑 낀 손으로 등불에 불을 붙인다. 달궈진 유리를 맨손으로 감싸 쥔 올리비아는 짝별을 그어 지운 그 손바닥이 타들어 가도 등불을 내려놓지 않고, 이선은 장갑 속 왼손이 타는 듯 아파 주먹을 쥐면서도 그게 짝별 때문이라는 걸 모른 척한다.</w:t>
-      </w:r>
-    </w:p>
-    <w:p>
-      <w:pPr>
-        <w:keepNext w:val="0"/>
-        <w:spacing w:after="120" w:before="0" w:line="331" w:lineRule="auto"/>
-      </w:pPr>
-      <w:r>
-        <w:rPr>
-          <w:rFonts w:ascii="맑은 고딕" w:hAnsi="맑은 고딕" w:eastAsia="맑은 고딕" w:cs="맑은 고딕"/>
-          <w:b w:val="0"/>
-          <w:sz w:val="21"/>
-        </w:rPr>
-        <w:t>마지막 불꽃이 꺼지자 올리비아는 다 탄 등불을 제나 앞에 내려놓는다. 「다 탔어. 사과는 불 지른 사람이 해.」 그리고 탄 손을 병으로 뻗는 순간, 제나가 먼저 병을 낚아챈다. 「손이 다 탔네, 언니. 이건 이제 못 들겠다.」</w:t>
+        <w:t>올리비아는 등불을 받아 들고 캐스피언을 본다. 「들게. 대신 불은 네가 붙여.」 캐스피언이 불을 붙이자 유리가 달아오르며 올리비아의 손바닥이 타들어 간다. 그런데 비틀거리는 건 캐스피언이다. 찢어도 남아 있던 각인 때문에 그녀의 고통이 장갑 속 그의 손바닥으로 그대로 건너온다. 캐스피언은 이를 악물고 주먹을 쥔 채 버티고, 올리비아는 눈 하나 깜빡하지 않는다. 불이 꺼지자 올리비아는 등불을 바닥에 내려놓는다. 「다 탔어. 사과는 불 지른 사람이 해.」 올리비아가 병으로 손을 뻗는 순간, 제나가 먼저 병을 낚아챈다.</w:t>
       </w:r>
     </w:p>
     <w:p>
@@ -4995,34 +4869,6 @@
     </w:p>
     <w:p>
       <w:pPr>
-        <w:keepNext w:val="0"/>
-        <w:spacing w:after="120" w:before="0" w:line="331" w:lineRule="auto"/>
-      </w:pPr>
-      <w:r>
-        <w:rPr>
-          <w:rFonts w:ascii="맑은 고딕" w:hAnsi="맑은 고딕" w:eastAsia="맑은 고딕" w:cs="맑은 고딕"/>
-          <w:b w:val="0"/>
-          <w:sz w:val="21"/>
-        </w:rPr>
-        <w:t>제나는 그 병을 올리비아 눈앞에 흔들며 빛 없는 딸한테 엄마 빛이 무슨 소용이냐고 비웃고는 바닥에 내리친다. 깨진 병에서 흘러나온 별빛이 공중으로 흩어지고, 올리비아가 탄 손으로 그 빛을 끌어모으려 하지만 빛은 손가락 사이로 꺼져 간다.</w:t>
-      </w:r>
-    </w:p>
-    <w:p>
-      <w:pPr>
-        <w:keepNext w:val="0"/>
-        <w:spacing w:after="120" w:before="0" w:line="331" w:lineRule="auto"/>
-      </w:pPr>
-      <w:r>
-        <w:rPr>
-          <w:rFonts w:ascii="맑은 고딕" w:hAnsi="맑은 고딕" w:eastAsia="맑은 고딕" w:cs="맑은 고딕"/>
-          <w:b w:val="0"/>
-          <w:sz w:val="21"/>
-        </w:rPr>
-        <w:t>어머니는 숨을 거두기 전, 빛을 잃은 어린 올리비아의 손에 그 병을 쥐여 주었다. 「네 빛은 꺼진 게 아니라 잠든 거야. 깨어날 때까지 엄마 빛을 갖고 있어.」</w:t>
-      </w:r>
-    </w:p>
-    <w:p>
-      <w:pPr>
         <w:keepNext/>
         <w:spacing w:after="120" w:before="0" w:line="331" w:lineRule="auto"/>
       </w:pPr>
@@ -5032,7 +4878,7 @@
           <w:b w:val="0"/>
           <w:sz w:val="21"/>
         </w:rPr>
-        <w:t>마지막 한 점까지 꺼지자 올리비아가 제나에게 달려들어 머리채를 잡아챈다. 이선은 3년 동안 짝별을 가려 온 장갑 낀 왼손으로 올리비아의 목을 움켜쥐고, 하객들은 불까지 지른 공주를 감옥에 처넣으라고 외친다. 이선은 지금 조르는 목이 숲에서 자기를 살린 소녀의 목이라는 걸 모른다. 숨이 막힌 올리비아가 이선을 본다. 「잘 기억해. 오늘 네가 조른 건 네 짝이야.」 그 순간 처음 보는 남자가 이선의 손을 떼어 내고 올리비아를 감싸 안는다. 눈이 멀었다는 소문과 달리 남자는 올리비아의 눈을 똑바로 들여다보고, 이선을 돌아보지도 않고 말한다. 「이 여자 목을 조른 손은, 내가 자른다.」</w:t>
+        <w:t>제나는 시체 같은 흑발에 엄마 물 따위가 무슨 소용이냐며 병을 바닥에 내리쳐 깨뜨린다. 흩어진 정령수가 마지막 빛을 내다 꺼지는 걸 본 순간, 올리비아가 제나의 머리채를 잡아 바닥에 처박는다. 캐스피언이 달려들어 장갑 낀 손으로 올리비아의 목을 움켜쥐고 떼어 낸다. 숨이 막혀 가는 올리비아가 그를 노려본다. 「잘 기억해. 오늘 네가 조른 건, 네 목숨 살린 네 진짜 짝이야.」 그 순간 연회장 문이 부서지고, 들어온 남자가 캐스피언의 팔을 꺾어 떼어 내고 올리비아를 안아 올린다. 눈이 멀었다던 밤의 왕 가브리엘이 캐스피언을 똑바로 본다. 「이 여자 목을 조른 그 손, 내가 자른다.」</w:t>
       </w:r>
     </w:p>
     <w:p>

</xml_diff>

<commit_message>
Auto commit (2026-10-06 20:27) — 2 changes
Claude Code 세션 종료 시 자동 커밋.

Co-Authored-By: Claude <noreply@anthropic.com>
Claude-Session: https://claude.ai/code/b8b53fcb-f8d6-4d92-a3e9-a236c8db2489
</commit_message>
<xml_diff>
--- a/projects/리메이크 러프 기획안 11종_v3.docx
+++ b/projects/리메이크 러프 기획안 11종_v3.docx
@@ -250,7 +250,7 @@
           <w:b/>
           <w:sz w:val="21"/>
         </w:rPr>
-        <w:t>Then Jump, Sister</w:t>
+        <w:t>The Blind King's Black-Haired Bride</w:t>
       </w:r>
     </w:p>
     <w:p>
@@ -4320,7 +4320,7 @@
           <w:color w:val="1F3A5F"/>
           <w:sz w:val="34"/>
         </w:rPr>
-        <w:t>[T1] Then Jump, Sister</w:t>
+        <w:t>[T1] The Blind King's Black-Haired Bride</w:t>
       </w:r>
     </w:p>
     <w:p>
@@ -4632,7 +4632,7 @@
           <w:b w:val="0"/>
           <w:sz w:val="21"/>
         </w:rPr>
-        <w:t>연회장 테라스 난간에 올라선 엘프 왕국 둘째 공주 제나가, 눈먼 밤의 왕에게 시집갈 바엔 뛰어내리겠다고 울부짖는다. 흑발의 제1공주 올리비아가 걸어 나온다. 어린 날 독에 쓰러진 소년의 독을 대신 빨아내다 백금발이 흑발로 변해, '재앙의 흑발'로 불려 온 공주다. 「죽고 싶어? 그럼 죽어.」 올리비아는 제나의 목덜미를 잡아 난간 밖으로 밀어 버린다. 떨어지던 제나를 국왕이 뻗은 정령의 바람이 겨우 받아 올린다. 올리비아가 아버지를 돌아본다. 「쟤가 죽어도 싫다는 그 혼인, 내가 갈게요. 값은 제대로 치르세요.」</w:t>
+        <w:t>절벽 위 엘프 왕궁 테라스, 둘째 공주 제나가 난간에 올라서서 눈먼 밤의 왕에게 시집갈 바엔 뛰어내리겠다고 울부짖는다. 왕비 다이앤은 국왕에게 딸이 하나 더 있지 않냐고 따진다. 그때 공중에 흑발의 제1공주 올리비아가 떠오른다. 소년의 독을 대신 빨아내다 백금발이 흑발로 변해 '재앙의 흑발'로 불리는 공주다. 「죽고 싶어? 그럼 죽어.」 올리비아의 덩굴이 제나를 칭칭 감아 절벽 밖으로 내던진다. 국왕이 뻗은 정령의 바람이 떨어지는 제나를 간신히 받아 올린다. 땅에 내려선 올리비아가 아버지를 본다. 「쟤가 죽어도 싫다는 그 혼인, 내가 갈게요. 값은 제대로 치르세요.」</w:t>
       </w:r>
     </w:p>
     <w:p>
@@ -4646,7 +4646,7 @@
           <w:b w:val="0"/>
           <w:sz w:val="21"/>
         </w:rPr>
-        <w:t>3년 전, 올리비아는 가디언으로 신분을 숨긴 이웃 나라 왕 캐스피언을 골랐다. 손을 잡는 순간 두 손바닥에 짝의 표식인 붉은 덩굴 각인이 피었지만, 캐스피언은 자기를 살린 백금발 소녀가 흑발 공주일 리 없다며 검은 장갑으로 각인을 덮었다. 그 소녀가 올리비아라는 걸, 제나의 백금발이 매일 바르는 마법 염색약이라는 걸 그는 모른다. 그리고 어젯밤, 3년 동안 그녀의 등불을 들던 캐스피언이 꺼진 복도에서 그녀에게 입을 맞추며 다른 이름을 불렀다. 「제나.」</w:t>
+        <w:t>3년 전, 올리비아는 가디언으로 신분을 숨긴 이웃 나라 왕 캐스피언을 골랐다. 손을 잡는 순간 두 손바닥에 붉은 짝 덩굴이 피었지만, 캐스피언은 자기를 살린 백금발 소녀가 흑발 공주일 리 없다며 검은 장갑으로 각인을 덮었다. 그 소녀가 올리비아이고 제나의 백금발은 마법 염색약이라는 걸 그는 모른다. 그리고 어젯밤, 3년간 그녀의 등불을 들던 그가 꺼진 복도에서 입을 맞추며 다른 이름을 불렀다. 「제나.」</w:t>
       </w:r>
     </w:p>
     <w:p>

</xml_diff>

<commit_message>
Auto commit (2026-10-06 20:31) — 2 changes
Claude Code 세션 종료 시 자동 커밋.

Co-Authored-By: Claude <noreply@anthropic.com>
Claude-Session: https://claude.ai/code/b8b53fcb-f8d6-4d92-a3e9-a236c8db2489
</commit_message>
<xml_diff>
--- a/projects/리메이크 러프 기획안 11종_v3.docx
+++ b/projects/리메이크 러프 기획안 11종_v3.docx
@@ -250,7 +250,7 @@
           <w:b/>
           <w:sz w:val="21"/>
         </w:rPr>
-        <w:t>The Blind King's Black-Haired Bride</w:t>
+        <w:t>Too Late, My Mate. I'm the Blind King's Queen</w:t>
       </w:r>
     </w:p>
     <w:p>
@@ -4320,7 +4320,7 @@
           <w:color w:val="1F3A5F"/>
           <w:sz w:val="34"/>
         </w:rPr>
-        <w:t>[T1] The Blind King's Black-Haired Bride</w:t>
+        <w:t>[T1] Too Late, My Mate. I'm the Blind King's Queen</w:t>
       </w:r>
     </w:p>
     <w:p>

</xml_diff>

<commit_message>
Auto commit (2026-10-06 20:32) — 2 changes
Claude Code 세션 종료 시 자동 커밋.

Co-Authored-By: Claude <noreply@anthropic.com>
</commit_message>
<xml_diff>
--- a/projects/리메이크 러프 기획안 11종_v3.docx
+++ b/projects/리메이크 러프 기획안 11종_v3.docx
@@ -250,7 +250,7 @@
           <w:b/>
           <w:sz w:val="21"/>
         </w:rPr>
-        <w:t>Too Late, My Mate. I'm the Night King's Queen</w:t>
+        <w:t>Too Late, My Mate. I'm the Elf King's Queen</w:t>
       </w:r>
     </w:p>
     <w:p>
@@ -4320,7 +4320,7 @@
           <w:color w:val="1F3A5F"/>
           <w:sz w:val="34"/>
         </w:rPr>
-        <w:t>[T1] Too Late, My Mate. I'm the Night King's Queen</w:t>
+        <w:t>[T1] Too Late, My Mate. I'm the Elf King's Queen</w:t>
       </w:r>
     </w:p>
     <w:p>
@@ -4791,7 +4791,7 @@
           <w:b w:val="0"/>
           <w:sz w:val="21"/>
         </w:rPr>
-        <w:t>지붕이 올리비아 위로 내려앉는 순간, 그녀의 몸에서 은빛 정령력이 터져 나와 불길을 통째로 삼킨다. 잿더미 위에 선 올리비아의 흑발이 한순간 눈부신 백금발로 빛났다가 다시 검게 가라앉는다. 밖에서는 불의 열기에 제나의 염색약이 녹아, 백금발 사이로 탁한 갈색이 줄줄 흘러내린다. 두 장면을 다 본 데미안은 연기 때문에 잘못 봤다며 고개를 돌리고, 제나의 머리를 망토로 덮어 준다. 같은 시각 밤의 왕국, 검은 비단으로 눈을 가린 왕 가브리엘이 신부가 불길에 갇혔다는 보고를 받는다. 가브리엘이 눈가리개를 풀자 서늘하게 멀쩡한 두 눈이 드러난다. 「말 준비해. 내 왕비는 내가 데려온다.」</w:t>
+        <w:t>지붕이 올리비아 위로 내려앉는 순간, 그녀의 몸에서 은빛 정령력이 터져 나와 불길을 통째로 삼킨다. 잿더미 위에 선 올리비아의 흑발이 한순간 눈부신 백금발로 빛났다가 다시 검게 가라앉는다. 밖에서는 불의 열기에 제나의 염색약이 녹아, 백금발 사이로 탁한 갈색이 줄줄 흘러내린다. 두 장면을 다 본 데미안은 연기 때문에 잘못 봤다며 고개를 돌리고, 제나의 머리를 망토로 덮어 준다. 같은 시각 밤의 왕국, 검은 비단으로 눈을 가린 엘프 왕 가브리엘이 신부가 불길에 갇혔다는 보고를 받는다. 가브리엘이 눈가리개를 풀자 서늘하게 멀쩡한 두 눈이 드러난다. 「말 준비해. 내 왕비는 내가 데려온다.」</w:t>
       </w:r>
     </w:p>
     <w:p>

</xml_diff>

<commit_message>
Auto commit (2026-10-06 20:35) — 2 changes
Claude Code 세션 종료 시 자동 커밋.

Co-Authored-By: Claude <noreply@anthropic.com>
Claude-Session: https://claude.ai/code/b8b53fcb-f8d6-4d92-a3e9-a236c8db2489
</commit_message>
<xml_diff>
--- a/projects/리메이크 러프 기획안 11종_v3.docx
+++ b/projects/리메이크 러프 기획안 11종_v3.docx
@@ -250,7 +250,7 @@
           <w:b/>
           <w:sz w:val="21"/>
         </w:rPr>
-        <w:t>Too Late, My Mate. I'm the Elf King's Queen</w:t>
+        <w:t>The Black-Haired Mate He Threw Away</w:t>
       </w:r>
     </w:p>
     <w:p>
@@ -4320,7 +4320,7 @@
           <w:color w:val="1F3A5F"/>
           <w:sz w:val="34"/>
         </w:rPr>
-        <w:t>[T1] Too Late, My Mate. I'm the Elf King's Queen</w:t>
+        <w:t>[T1] The Black-Haired Mate He Threw Away</w:t>
       </w:r>
     </w:p>
     <w:p>
@@ -4511,7 +4511,7 @@
           <w:b w:val="0"/>
           <w:sz w:val="21"/>
         </w:rPr>
-        <w:t>어린 날 독에 쓰러진 소년을 살리고 백금발을 잃어 '재앙의 흑발'로 멸시받는 엘프 공주가, 마법 염색으로 백금발을 꾸민 이복동생을 그 소녀로 믿는 운명의 짝을 먼저 버리고, 동생이 죽어도 싫다던 눈먼 왕과의 혼인을 스스로 거래해, 끝내 백금발로 깨어나 그 왕의 왕비가 되는 이야기.</w:t>
+        <w:t>계모 손에 백금발을 검게 물들여 '재앙의 흑발'로 멸시받는 엘프 공주가, 백금발로 염색한 이복동생을 어린 날 자기 목숨을 구한 소녀로 믿는 운명의 짝을 먼저 버리고, 동생이 죽어도 싫다던 다크 엘프 왕과의 혼인을 스스로 거래해, 끝내 백금발을 되찾고 그 왕의 왕비가 되는 이야기.</w:t>
       </w:r>
     </w:p>
     <w:p>
@@ -4587,7 +4587,7 @@
           <w:b w:val="0"/>
           <w:sz w:val="21"/>
         </w:rPr>
-        <w:t>4. 웨어울프 ㅡ&gt; 엘프 치환 (백금발 = 순혈의 상징, 흑발 = 재앙)</w:t>
+        <w:t>4. 웨어울프 ㅡ&gt; 엘프 치환 (백금발 = 순혈의 상징, 흑발 = 적국 다크 엘프의 색)</w:t>
       </w:r>
     </w:p>
     <w:p>
@@ -4632,7 +4632,7 @@
           <w:b w:val="0"/>
           <w:sz w:val="21"/>
         </w:rPr>
-        <w:t>절벽 위 엘프 왕궁 테라스, 둘째 공주 제나가 난간에 올라서서 눈먼 밤의 왕에게 시집갈 바엔 뛰어내리겠다고 울부짖는다. 왕비 다이앤은 국왕에게 딸이 하나 더 있지 않냐고 따진다. 그때 공중에 흑발의 제1공주 올리비아가 떠오른다. 소년의 독을 대신 빨아내다 백금발이 흑발로 변해 '재앙의 흑발'로 불리는 공주다. 「죽고 싶어? 그럼 죽어.」 올리비아의 덩굴이 제나를 칭칭 감아 절벽 밖으로 내던진다. 국왕이 뻗은 정령의 바람이 떨어지는 제나를 간신히 받아 올린다. 땅에 내려선 올리비아가 아버지를 본다. 「쟤가 죽어도 싫다는 그 혼인, 내가 갈게요. 값은 제대로 치르세요.」</w:t>
+        <w:t>절벽 위 엘프 왕궁 테라스, 둘째 공주 제나가 난간에 올라서서 눈이 멀었다는 다크 엘프 왕에게 시집갈 바엔 뛰어내리겠다고 울부짖는다. 왕비 다이앤은 국왕에게 딸이 하나 더 있지 않냐고 따진다. 그때 공중에 흑발의 제1공주 올리비아가 떠오른다. 타고난 백금발을 계모 손에 검게 물들여, '재앙의 흑발'로 불리는 공주다. 「죽고 싶어? 그럼 죽어.」 올리비아의 덩굴이 제나를 칭칭 감아 절벽 밖으로 내던진다. 국왕이 뻗은 정령의 바람이 떨어지는 제나를 간신히 받아 올린다. 땅에 내려선 올리비아가 아버지를 본다. 「쟤가 죽어도 싫다는 그 혼인, 내가 갈게요. 값은 제대로 치르세요.」</w:t>
       </w:r>
     </w:p>
     <w:p>
@@ -4675,7 +4675,7 @@
           <w:b w:val="0"/>
           <w:sz w:val="21"/>
         </w:rPr>
-        <w:t>다음 날 아침 궁정이 다 모인 연회장, 올리비아가 데미안의 장갑을 잡아 벗긴다. 숨겨 온 붉은 덩굴 각인이 모두 앞에 드러나고, 올리비아는 단검으로 자기 손바닥의 각인을 그어 찢는다. 「너 같은 짝, 내가 먼저 버린다.」 피가 떨어지는 손으로 올리비아는 국왕 앞에 서서, 제나 대신 밤의 왕국 왕비가 되겠다고 궁정 앞에서 선언한다. 귀족들은 재앙의 흑발이 눈먼 왕에게는 딱 맞는 짝이라고 웃고, 제나는 데미안의 팔에 매달려 언니가 자기를 죽이려 했다고 운다. 데미안은 올리비아의 피 흐르는 손을 내려다보며 차갑게 말한다. 「어디 가나 보자. 일주일도 못 버티고 돌아올 테니.」</w:t>
+        <w:t>다음 날 아침 궁정이 다 모인 연회장, 올리비아가 데미안의 장갑을 잡아 벗긴다. 숨겨 온 붉은 덩굴 각인이 모두 앞에 드러나고, 올리비아는 단검으로 자기 손바닥의 각인을 그어 찢는다. 「너 같은 짝, 내가 먼저 버린다.」 피가 떨어지는 손으로 올리비아는 국왕 앞에 서서, 제나 대신 다크 엘프 왕국 왕비가 되겠다고 궁정 앞에서 선언한다. 귀족들은 재앙의 흑발은 흑발 다크 엘프에게나 어울린다고 웃고, 제나는 데미안의 팔에 매달려 언니가 자기를 죽이려 했다고 운다. 데미안은 올리비아의 피 흐르는 손을 내려다보며 차갑게 말한다. 「어디 가나 보자. 일주일도 못 버티고 돌아올 테니.」</w:t>
       </w:r>
     </w:p>
     <w:p>
@@ -4704,7 +4704,7 @@
           <w:b w:val="0"/>
           <w:sz w:val="21"/>
         </w:rPr>
-        <w:t>그날 밤 데미안은 부관이 가져온, 영원히 꺼지지 않는 정령 보석을 제나의 생일 선물로 받아 든다. 어린 날 숲에서 독에 쓰러졌을 때 백금발 소녀가 입으로 독을 빨아냈다. 흐려지는 눈으로 본 마지막 모습은 백금발이었고, 그 소녀의 머리가 검게 변하는 순간을 그는 보지 못했다. 다음 날 마구간, 올리비아는 밤의 왕국으로 타고 갈 흰 말의 갈기에 혼례 리본을 땋고 있다. 따라온 데미안이 갈 생각도 없으면서 쇼하지 말라고 비웃자, 올리비아는 마지막 리본을 꽉 묶는다. 「착각하지 마. 다음 달이면 나, 밤의 왕국 왕비야.」</w:t>
+        <w:t>그날 밤 데미안은 부관이 가져온, 영원히 꺼지지 않는 정령 보석을 제나의 생일 선물로 받아 든다. 어린 날 숲에서 독에 쓰러졌을 때 백금발 소녀가 입으로 독을 빨아냈다. 어머니가 죽은 뒤 계모가 그 백금발을 검게 물들였고, 올리비아가 씻어 낼 때마다 국왕은 계모 말만 듣고 딸을 때렸다는 걸 그는 모른다. 다음 날 마구간, 올리비아는 다크 엘프 왕국으로 타고 갈 흰 말의 갈기에 혼례 리본을 땋고 있다. 따라온 데미안이 갈 생각도 없으면서 쇼하지 말라고 비웃자, 올리비아는 마지막 리본을 꽉 묶는다. 「착각하지 마. 다음 달이면 나, 다크 엘프 왕국 왕비야.」</w:t>
       </w:r>
     </w:p>
     <w:p>
@@ -4791,7 +4791,7 @@
           <w:b w:val="0"/>
           <w:sz w:val="21"/>
         </w:rPr>
-        <w:t>지붕이 올리비아 위로 내려앉는 순간, 그녀의 몸에서 은빛 정령력이 터져 나와 불길을 통째로 삼킨다. 잿더미 위에 선 올리비아의 흑발이 한순간 눈부신 백금발로 빛났다가 다시 검게 가라앉는다. 밖에서는 불의 열기에 제나의 염색약이 녹아, 백금발 사이로 탁한 갈색이 줄줄 흘러내린다. 두 장면을 다 본 데미안은 연기 때문에 잘못 봤다며 고개를 돌리고, 제나의 머리를 망토로 덮어 준다. 같은 시각 밤의 왕국, 검은 비단으로 눈을 가린 엘프 왕 가브리엘이 신부가 불길에 갇혔다는 보고를 받는다. 가브리엘이 눈가리개를 풀자 서늘하게 멀쩡한 두 눈이 드러난다. 「말 준비해. 내 왕비는 내가 데려온다.」</w:t>
+        <w:t>지붕이 올리비아 위로 내려앉는 순간, 그녀의 몸에서 은빛 정령력이 터져 나와 불길을 통째로 삼킨다. 불길에 검은 물이 타 버려, 잿더미 위에 선 올리비아의 머리에서 눈부신 백금발이 드러난다. 밖에서는 불의 열기에 제나의 염색약이 녹아, 백금발 사이로 탁한 갈색이 줄줄 흘러내린다. 두 장면을 다 본 데미안은 연기 때문에 잘못 봤다며 고개를 돌리고, 제나의 머리를 망토로 덮어 준다. 같은 시각 다크 엘프 왕국, 검은 비단으로 눈을 가린 흑발의 다크 엘프 왕, 엘프 가운데 가장 강하다는 가브리엘이 신부가 불길에 갇혔다는 보고를 받는다. 가브리엘이 눈가리개를 풀자 서늘하게 멀쩡한 두 눈이 드러난다. 「말 준비해. 내 왕비는 내가 데려온다.」</w:t>
       </w:r>
     </w:p>
     <w:p>
@@ -4878,7 +4878,7 @@
           <w:b w:val="0"/>
           <w:sz w:val="21"/>
         </w:rPr>
-        <w:t>제나는 시체 같은 흑발에 엄마 물 따위가 무슨 소용이냐며 병을 바닥에 내리쳐 깨뜨린다. 흩어진 정령수가 마지막 빛을 내다 꺼지는 걸 본 순간, 올리비아가 제나의 머리채를 잡아 바닥에 처박는다. 데미안이 달려들어 장갑 낀 손으로 올리비아의 목을 움켜쥐고 떼어 낸다. 숨이 막혀 가는 올리비아가 그를 노려본다. 「잘 기억해. 오늘 네가 조른 건, 네 목숨 살린 네 진짜 짝이야.」 그 순간 연회장 문이 부서지고, 들어온 남자가 데미안의 팔을 꺾어 떼어 내고 올리비아를 안아 올린다. 눈이 멀었다던 밤의 왕 가브리엘이 데미안을 똑바로 본다. 「이 여자 목을 조른 그 손, 내가 자른다.」</w:t>
+        <w:t>제나는 검게 물든 머리에 엄마 물 따위가 무슨 소용이냐며 병을 바닥에 내리쳐 깨뜨린다. 흩어진 정령수가 마지막 빛을 내다 꺼지는 걸 본 순간, 올리비아가 제나의 머리채를 잡아 바닥에 처박는다. 데미안이 달려들어 장갑 낀 손으로 올리비아의 목을 움켜쥐고 떼어 낸다. 숨이 막혀 가는 올리비아가 그를 노려본다. 「잘 기억해. 오늘 네가 조른 건, 네 목숨 살린 네 진짜 짝이야.」 그 순간 연회장 문이 부서지고, 들어온 남자가 데미안의 팔을 꺾어 떼어 내고 올리비아를 안아 올린다. 눈이 멀었다던 다크 엘프 왕 가브리엘이 데미안을 똑바로 본다. 「이 여자 목을 조른 그 손, 내가 자른다.」</w:t>
       </w:r>
     </w:p>
     <w:p>

</xml_diff>

<commit_message>
Auto commit (2026-10-06 20:38) — 2 changes
Claude Code 세션 종료 시 자동 커밋.

Co-Authored-By: Claude <noreply@anthropic.com>
</commit_message>
<xml_diff>
--- a/projects/리메이크 러프 기획안 11종_v3.docx
+++ b/projects/리메이크 러프 기획안 11종_v3.docx
@@ -4762,7 +4762,7 @@
           <w:b w:val="0"/>
           <w:sz w:val="21"/>
         </w:rPr>
-        <w:t>불길이 순식간에 마구간 지붕까지 번진다. 쓰러진 기둥에 올리비아의 다리가 깔리고, 반대편 칸에서는 제나가 머리를 감싸 쥐고 비명을 지른다. 불 속으로 뛰어든 데미안 앞에서 지붕이 무너지며 길이 하나만 남는다. 둘 중 한 사람만 안고 나갈 수 있다. 올리비아는 살려 달라는 말 대신 데미안의 눈을 똑바로 본다. 「누구한테 가는지, 내가 똑똑히 볼 거야.」 데미안은 그 눈을 피해 제나를 안아 들고, 불길 밖으로 달려 나간다.</w:t>
+        <w:t>불길이 순식간에 마구간 지붕까지 번지고, 연기 속에서 검은 복면의 자객들이 칼을 뽑아 든다. 혼례 전에 올리비아를 없애라고 계모 다이앤이 풀어 둔 자들이다. 기둥에 다리가 깔린 올리비아를 자객들이 에워싸고, 반대편 칸에서는 연기에 갇힌 제나가 비명을 지른다. 불 속으로 뛰어든 데미안 앞에서 지붕이 무너지며 길이 하나만 남는다. 칼날 앞의 올리비아와 불 속의 제나, 한 사람만 데리고 나갈 수 있다. 올리비아는 살려 달라는 말 대신 데미안의 눈을 똑바로 본다. 「누구한테 가는지, 내가 똑똑히 볼 거야.」 데미안은 그 눈을 피해 제나를 안아 들고, 불길 밖으로 달려 나간다.</w:t>
       </w:r>
     </w:p>
     <w:p>
@@ -4791,7 +4791,7 @@
           <w:b w:val="0"/>
           <w:sz w:val="21"/>
         </w:rPr>
-        <w:t>지붕이 올리비아 위로 내려앉는 순간, 그녀의 몸에서 은빛 정령력이 터져 나와 불길을 통째로 삼킨다. 불길에 검은 물이 타 버려, 잿더미 위에 선 올리비아의 머리에서 눈부신 백금발이 드러난다. 밖에서는 불의 열기에 제나의 염색약이 녹아, 백금발 사이로 탁한 갈색이 줄줄 흘러내린다. 두 장면을 다 본 데미안은 연기 때문에 잘못 봤다며 고개를 돌리고, 제나의 머리를 망토로 덮어 준다. 같은 시각 다크 엘프 왕국, 검은 비단으로 눈을 가린 흑발의 다크 엘프 왕, 엘프 가운데 가장 강하다는 가브리엘이 신부가 불길에 갇혔다는 보고를 받는다. 가브리엘이 눈가리개를 풀자 서늘하게 멀쩡한 두 눈이 드러난다. 「말 준비해. 내 왕비는 내가 데려온다.」</w:t>
+        <w:t>남겨진 올리비아에게 자객들의 칼이 쏟아진다. 팔이 베이고 뺨이 갈라져도, 올리비아는 깔린 다리를 끌어내 단검 하나로 버티다 피투성이로 쓰러진다. 마지막 칼날이 내려오는 순간, 그녀의 몸에서 은빛 정령력이 터져 자객들을 날려 버리고 불길을 통째로 삼킨다. 불빛에 그을린 머리끝 한 가닥이 백금빛으로 번뜩인다. 그 빛을 보고 돌아온 데미안이 무릎을 꿇지만, 올리비아는 눈을 감는다. 「이미 골랐잖아. 이제 와서 걱정하는 척하지 마.」 그때 녹아내린 염색약을 망토로 가린 제나가 긁힌 팔을 내밀며 언니 때문에 다쳤다고 울고, 데미안은 다시 제나를 안아 든다. 같은 시각, 눈을 검은 비단으로 가린 흑발의 다크 엘프 왕 가브리엘이 신부가 피투성이가 됐다는 보고를 받고 눈가리개를 푼다. 멀쩡한 두 눈이 서늘하다. 「말 준비해. 내 왕비는 내가 데려온다.」</w:t>
       </w:r>
     </w:p>
     <w:p>
@@ -4820,7 +4820,7 @@
           <w:b w:val="0"/>
           <w:sz w:val="21"/>
         </w:rPr>
-        <w:t>사흘 뒤 제나의 생일 연회, 다리를 절며 들어선 올리비아를 하객들이 방화범이라 손가락질한다. 데미안은 꺼지지 않는 정령 보석을 제나 목에 걸어 주고, 하객들은 진짜 구원자에게 어울리는 선물이라며 박수를 친다. 그때 제나가 작은 유리병 하나를 꺼내 흔든다. 올리비아의 혼례 짐에서 몰래 빼낸, 어머니가 숨을 거두며 남긴 마지막 정령수다. 올리비아가 돌려 달라고 다가서자 데미안이 막아선다. 제나에게 사과하고, 불붙은 유리 등불을 맨손으로 감싸 쥔 채 불이 다 꺼질 때까지 버티면 병을 돌려주겠다고 한다. 제나가 등불을 내밀며 웃는다. 「오늘도 내 등불 들고 서 있어 봐.」</w:t>
+        <w:t>사흘 뒤 제나의 생일 연회, 뺨에 칼자국이 남은 채 다리를 절며 들어선 올리비아를 하객들이 방화범이라 손가락질한다. 데미안은 꺼지지 않는 정령 보석을 제나 목에 걸어 주고, 하객들은 진짜 구원자에게 어울리는 선물이라며 박수를 친다. 그때 제나가 작은 유리병 하나를 꺼내 흔든다. 올리비아의 혼례 짐에서 몰래 빼낸, 어머니가 숨을 거두며 남긴 마지막 정령수다. 올리비아가 돌려 달라고 다가서자 데미안이 막아선다. 제나에게 사과하고, 불붙은 유리 등불을 맨손으로 감싸 쥔 채 불이 다 꺼질 때까지 버티면 병을 돌려주겠다고 한다. 제나가 등불을 내밀며 웃는다. 「오늘도 내 등불 들고 서 있어 봐.」</w:t>
       </w:r>
     </w:p>
     <w:p>
@@ -4878,7 +4878,7 @@
           <w:b w:val="0"/>
           <w:sz w:val="21"/>
         </w:rPr>
-        <w:t>제나는 검게 물든 머리에 엄마 물 따위가 무슨 소용이냐며 병을 바닥에 내리쳐 깨뜨린다. 흩어진 정령수가 마지막 빛을 내다 꺼지는 걸 본 순간, 올리비아가 제나의 머리채를 잡아 바닥에 처박는다. 데미안이 달려들어 장갑 낀 손으로 올리비아의 목을 움켜쥐고 떼어 낸다. 숨이 막혀 가는 올리비아가 그를 노려본다. 「잘 기억해. 오늘 네가 조른 건, 네 목숨 살린 네 진짜 짝이야.」 그 순간 연회장 문이 부서지고, 들어온 남자가 데미안의 팔을 꺾어 떼어 내고 올리비아를 안아 올린다. 눈이 멀었다던 다크 엘프 왕 가브리엘이 데미안을 똑바로 본다. 「이 여자 목을 조른 그 손, 내가 자른다.」</w:t>
+        <w:t>제나는 검게 물든 머리에 엄마 물 따위가 무슨 소용이냐며 병을 바닥에 내리쳐 깨뜨린다. 흩어진 정령수가 마지막 빛을 내다 꺼지는 걸 본 순간, 올리비아가 제나의 머리채를 잡아 바닥에 처박는다. 데미안이 달려들어 장갑 낀 손으로 올리비아의 목을 움켜쥐고 떼어 낸다. 숨이 막혀 가는 올리비아가 그를 노려본다. 「잘 기억해. 지금 네가 목 조르는 여자가, 네 목숨 살린 진짜 짝이야.」 그 순간 연회장 문이 부서지고, 들어온 남자가 데미안의 팔을 꺾어 떼어 내고 올리비아를 안아 올린다. 눈이 멀었다던 다크 엘프 왕 가브리엘이 데미안을 똑바로 본다. 「감히 누구 신부 목을 졸라. 그 손, 오늘 부러진다.」</w:t>
       </w:r>
     </w:p>
     <w:p>

</xml_diff>

<commit_message>
Auto commit (2026-10-06 20:40) — 2 changes
Claude Code 세션 종료 시 자동 커밋.

Co-Authored-By: Claude <noreply@anthropic.com>
</commit_message>
<xml_diff>
--- a/projects/리메이크 러프 기획안 11종_v3.docx
+++ b/projects/리메이크 러프 기획안 11종_v3.docx
@@ -250,7 +250,7 @@
           <w:b/>
           <w:sz w:val="21"/>
         </w:rPr>
-        <w:t>The Black-Haired Mate He Threw Away</w:t>
+        <w:t>The Black-Haired Princess He Threw Away</w:t>
       </w:r>
     </w:p>
     <w:p>
@@ -4320,7 +4320,7 @@
           <w:color w:val="1F3A5F"/>
           <w:sz w:val="34"/>
         </w:rPr>
-        <w:t>[T1] The Black-Haired Mate He Threw Away</w:t>
+        <w:t>[T1] The Black-Haired Princess He Threw Away</w:t>
       </w:r>
     </w:p>
     <w:p>
@@ -4481,7 +4481,7 @@
           <w:b w:val="0"/>
           <w:sz w:val="21"/>
         </w:rPr>
-        <w:t xml:space="preserve">  #Rejected Mate, Fated Mates, Hidden Identity, Elf</w:t>
+        <w:t xml:space="preserve">  #Soulmates, All Too Late, Hidden Identity, Elf</w:t>
       </w:r>
     </w:p>
     <w:p>
@@ -4511,7 +4511,7 @@
           <w:b w:val="0"/>
           <w:sz w:val="21"/>
         </w:rPr>
-        <w:t>계모 손에 백금발을 검게 물들여 '재앙의 흑발'로 멸시받는 엘프 공주가, 백금발로 염색한 이복동생을 어린 날 자기 목숨을 구한 소녀로 믿는 운명의 짝을 먼저 버리고, 동생이 죽어도 싫다던 다크 엘프 왕과의 혼인을 스스로 거래해, 끝내 백금발을 되찾고 그 왕의 왕비가 되는 이야기.</w:t>
+        <w:t>계모 손에 백금발을 검게 물들여 '재앙의 흑발'로 멸시받는 엘프 공주가, 백금발로 염색한 이복동생을 어린 날 자기 목숨을 구한 소녀로 믿는 영혼의 반려를 먼저 버리고, 동생이 죽어도 싫다던 다크 엘프 왕과의 혼인을 스스로 거래해, 끝내 백금발을 되찾고 그 왕의 왕비가 되는 이야기.</w:t>
       </w:r>
     </w:p>
     <w:p>
@@ -4557,7 +4557,7 @@
           <w:b w:val="0"/>
           <w:sz w:val="21"/>
         </w:rPr>
-        <w:t>2. 염색한 가짜를 구원자로 믿고 진짜 짝을 짓밟는 남자, 거절당한 짝의 후회물 정석</w:t>
+        <w:t>2. 염색한 가짜를 구원자로 믿고 진짜 반려를 짓밟는 남자, 버림받은 반려의 후회물 정석</w:t>
       </w:r>
     </w:p>
     <w:p>
@@ -4632,7 +4632,7 @@
           <w:b w:val="0"/>
           <w:sz w:val="21"/>
         </w:rPr>
-        <w:t>절벽 위 엘프 왕궁 테라스, 둘째 공주 제나가 난간에 올라서서 눈이 멀었다는 다크 엘프 왕에게 시집갈 바엔 뛰어내리겠다고 울부짖는다. 왕비 다이앤은 국왕에게 딸이 하나 더 있지 않냐고 따진다. 그때 공중에 흑발의 제1공주 올리비아가 떠오른다. 타고난 백금발을 계모 손에 검게 물들여, '재앙의 흑발'로 불리는 공주다. 「죽고 싶어? 그럼 죽어.」 올리비아의 덩굴이 제나를 칭칭 감아 절벽 밖으로 내던진다. 국왕이 뻗은 정령의 바람이 떨어지는 제나를 간신히 받아 올린다. 땅에 내려선 올리비아가 아버지를 본다. 「쟤가 죽어도 싫다는 그 혼인, 내가 갈게요. 값은 제대로 치르세요.」</w:t>
+        <w:t>절벽 위 엘프 왕궁 테라스, 둘째 공주 제나가 난간에 올라서서 눈이 멀었다는 다크 엘프 왕에게 시집갈 바엔 뛰어내리겠다고 울부짖는다. 왕비 다이앤은 딸이 하나 더 있지 않냐고 따진다. 그때 공중에 흑발의 제1공주 올리비아가 떠오른다. 타고난 백금발을 계모 손에 검게 물들여, '재앙의 흑발'로 불리는 공주다. 「죽고 싶어? 그럼 죽어.」 올리비아의 덩굴이 제나를 칭칭 감아 절벽 밖으로 내던진다. 국왕이 뻗은 정령의 바람이 떨어지는 제나를 간신히 받아 올린다. 땅에 내려선 올리비아가 아버지를 본다. 「쟤가 죽어도 싫다는 그 혼인, 내가 갈게요. 값은 제대로 치르세요.」</w:t>
       </w:r>
     </w:p>
     <w:p>
@@ -4646,7 +4646,7 @@
           <w:b w:val="0"/>
           <w:sz w:val="21"/>
         </w:rPr>
-        <w:t>3년 전, 올리비아는 가디언으로 신분을 숨긴 이웃 나라 왕 데미안을 골랐다. 손을 잡는 순간 두 손바닥에 붉은 짝 덩굴이 피었지만, 데미안은 자기를 살린 백금발 소녀가 흑발 공주일 리 없다며 검은 장갑으로 각인을 덮었다. 그 소녀가 올리비아이고 제나의 백금발은 마법 염색약이라는 걸 그는 모른다. 그리고 어젯밤, 3년간 그녀의 등불을 들던 그가 꺼진 복도에서 입을 맞추며 다른 이름을 불렀다. 「제나.」</w:t>
+        <w:t>3년 전, 올리비아는 가디언으로 신분을 숨긴 이웃 나라 왕 데미안을 골랐다. 손을 잡는 순간 두 손바닥에 영혼의 반려 표식인 붉은 덩굴이 피었지만, 데미안은 자기를 살린 백금발 소녀가 흑발 공주일 리 없다며 검은 장갑으로 각인을 덮었다. 그 소녀가 올리비아이고 제나의 백금발은 마법 염색약이라는 걸 그는 모른다. 어젯밤, 3년간 그녀의 등불을 들던 그가 꺼진 복도에서 입을 맞추며 다른 이름을 불렀다. 「제나.」</w:t>
       </w:r>
     </w:p>
     <w:p>
@@ -4675,7 +4675,7 @@
           <w:b w:val="0"/>
           <w:sz w:val="21"/>
         </w:rPr>
-        <w:t>다음 날 아침 궁정이 다 모인 연회장, 올리비아가 데미안의 장갑을 잡아 벗긴다. 숨겨 온 붉은 덩굴 각인이 모두 앞에 드러나고, 올리비아는 단검으로 자기 손바닥의 각인을 그어 찢는다. 「너 같은 짝, 내가 먼저 버린다.」 피가 떨어지는 손으로 올리비아는 국왕 앞에 서서, 제나 대신 다크 엘프 왕국 왕비가 되겠다고 궁정 앞에서 선언한다. 귀족들은 재앙의 흑발은 흑발 다크 엘프에게나 어울린다고 웃고, 제나는 데미안의 팔에 매달려 언니가 자기를 죽이려 했다고 운다. 데미안은 올리비아의 피 흐르는 손을 내려다보며 차갑게 말한다. 「어디 가나 보자. 일주일도 못 버티고 돌아올 테니.」</w:t>
+        <w:t>다음 날 아침 궁정이 다 모인 연회장, 올리비아가 데미안의 장갑을 잡아 벗긴다. 숨겨 온 붉은 덩굴 각인이 모두 앞에 드러나고, 올리비아는 단검으로 자기 손바닥의 각인을 그어 찢는다. 「너 같은 반려는 필요 없어. 내가 먼저 버린다.」 피가 떨어지는 손으로 올리비아는 국왕 앞에 서서, 제나 대신 다크 엘프 왕국 왕비가 되겠다고 궁정 앞에서 선언한다. 귀족들은 재앙의 흑발은 흑발 다크 엘프에게나 어울린다고 웃고, 제나는 데미안의 팔에 매달려 언니가 자기를 죽이려 했다고 운다. 데미안은 올리비아의 피 흐르는 손을 내려다보며 차갑게 말한다. 「어디 가나 보자. 일주일도 못 버티고 돌아올 테니.」</w:t>
       </w:r>
     </w:p>
     <w:p>
@@ -4878,7 +4878,7 @@
           <w:b w:val="0"/>
           <w:sz w:val="21"/>
         </w:rPr>
-        <w:t>제나는 검게 물든 머리에 엄마 물 따위가 무슨 소용이냐며 병을 바닥에 내리쳐 깨뜨린다. 흩어진 정령수가 마지막 빛을 내다 꺼지는 걸 본 순간, 올리비아가 제나의 머리채를 잡아 바닥에 처박는다. 데미안이 달려들어 장갑 낀 손으로 올리비아의 목을 움켜쥐고 떼어 낸다. 숨이 막혀 가는 올리비아가 그를 노려본다. 「잘 기억해. 지금 네가 목 조르는 여자가, 네 목숨 살린 진짜 짝이야.」 그 순간 연회장 문이 부서지고, 들어온 남자가 데미안의 팔을 꺾어 떼어 내고 올리비아를 안아 올린다. 눈이 멀었다던 다크 엘프 왕 가브리엘이 데미안을 똑바로 본다. 「감히 누구 신부를 건드려! 절대 가만두지 않겠다!」</w:t>
+        <w:t>제나는 검게 물든 머리에 엄마 물 따위가 무슨 소용이냐며 병을 바닥에 내리쳐 깨뜨린다. 흩어진 정령수가 마지막 빛을 내다 꺼지는 걸 본 순간, 올리비아가 제나의 머리채를 잡아 바닥에 처박는다. 데미안이 달려들어 장갑 낀 손으로 올리비아의 목을 움켜쥐고 떼어 낸다. 숨이 막혀 가는 올리비아가 그를 노려본다. 「잘 기억해. 지금 네가 목 조르는 여자가, 그날 숲에서 네 목숨 살린 그 아이야.」 그 순간 연회장 문이 부서지고, 들어온 남자가 데미안의 팔을 꺾어 떼어 내고 올리비아를 안아 올린다. 눈이 멀었다던 다크 엘프 왕 가브리엘이 데미안을 똑바로 본다. 「감히 누구 신부를 건드려! 절대 가만두지 않겠다!」</w:t>
       </w:r>
     </w:p>
     <w:p>

</xml_diff>

<commit_message>
Auto commit (2026-10-06 20:43) — 2 changes
Claude Code 세션 종료 시 자동 커밋.

Co-Authored-By: Claude <noreply@anthropic.com>
</commit_message>
<xml_diff>
--- a/projects/리메이크 러프 기획안 11종_v3.docx
+++ b/projects/리메이크 러프 기획안 11종_v3.docx
@@ -4646,7 +4646,7 @@
           <w:b w:val="0"/>
           <w:sz w:val="21"/>
         </w:rPr>
-        <w:t>3년 전, 올리비아는 가디언으로 신분을 숨긴 이웃 나라 왕 데미안을 골랐다. 손을 잡는 순간 두 손바닥에 영혼의 반려 표식인 붉은 덩굴이 피었지만, 데미안은 자기를 살린 백금발 소녀가 흑발 공주일 리 없다며 검은 장갑으로 각인을 덮었다. 그 소녀가 올리비아이고 제나의 백금발은 마법 염색약이라는 걸 그는 모른다. 어젯밤, 3년간 그녀의 등불을 들던 그가 꺼진 복도에서 입을 맞추며 다른 이름을 불렀다. 「제나.」</w:t>
+        <w:t>3년 전, 올리비아는 왕궁 최강의 기사 데미안을 자기 호위 기사로 골랐다. 손을 잡는 순간 두 손바닥에 영혼의 반려 표식인 붉은 덩굴이 피었지만, 데미안은 자기를 살린 백금발 소녀가 흑발 공주일 리 없다며 검은 장갑으로 각인을 덮었다. 그 소녀가 올리비아이고 제나의 백금발은 마법 염색약이라는 걸 그는 모른다. 어젯밤, 3년간 그녀의 등불을 들던 그가 꺼진 복도에서 입을 맞추며 다른 이름을 불렀다. 「제나.」</w:t>
       </w:r>
     </w:p>
     <w:p>
@@ -4675,7 +4675,7 @@
           <w:b w:val="0"/>
           <w:sz w:val="21"/>
         </w:rPr>
-        <w:t>다음 날 아침 궁정이 다 모인 연회장, 올리비아가 데미안의 장갑을 잡아 벗긴다. 숨겨 온 붉은 덩굴 각인이 모두 앞에 드러나고, 올리비아는 단검으로 자기 손바닥의 각인을 그어 찢는다. 「너 같은 반려는 필요 없어. 내가 먼저 버린다.」 피가 떨어지는 손으로 올리비아는 국왕 앞에 서서, 제나 대신 다크 엘프 왕국 왕비가 되겠다고 궁정 앞에서 선언한다. 귀족들은 재앙의 흑발은 흑발 다크 엘프에게나 어울린다고 웃고, 제나는 데미안의 팔에 매달려 언니가 자기를 죽이려 했다고 운다. 데미안은 올리비아의 피 흐르는 손을 내려다보며 차갑게 말한다. 「어디 가나 보자. 일주일도 못 버티고 돌아올 테니.」</w:t>
+        <w:t>다음 날 아침 궁정이 다 모인 연회장, 올리비아가 데미안의 장갑을 잡아 벗긴다. 숨겨 온 붉은 덩굴 각인이 모두 앞에 드러나고, 올리비아는 단검으로 자기 손바닥의 각인을 그어 찢는다. 「너 같은 반려는 필요 없어. 내가 먼저 버린다.」 피가 떨어지는 손으로 올리비아는 국왕 앞에 서서, 제나 대신 다크 엘프 왕국 왕비가 되겠다고 궁정 앞에서 선언한다. 궁정은 이미 계모 다이앤 손에 있어 흑발 공주의 말을 듣는 이가 없다. 귀족들은 재앙의 흑발은 흑발 다크 엘프에게나 어울린다고 웃고, 제나는 데미안의 팔에 매달려 언니가 자기를 죽이려 했다고 운다. 데미안은 올리비아의 피 흐르는 손을 내려다보며 차갑게 말한다. 「어디 가나 보자. 일주일도 못 버티고 돌아올 테니.」</w:t>
       </w:r>
     </w:p>
     <w:p>
@@ -4733,7 +4733,7 @@
           <w:b w:val="0"/>
           <w:sz w:val="21"/>
         </w:rPr>
-        <w:t>그때 제나가 들어와, 눈먼 왕은 말 색도 못 볼 테니 그 흰 말은 백금발인 자기한테 어울린다고 조른다. 데미안은 올리비아가 쥐고 있던 고삐를 빼앗아 제나 손에 쥐여 준다. 마구간 앞에 궁정 사람들이 몰려들자, 제나는 고삐를 올리비아 발밑에 던지고 웃는다. 「언니가 끌어. 마부처럼.」 올리비아는 고삐를 주워 데미안의 가슴에 던진다. 「네가 끌어. 3년 동안 내 등불 들던 손이잖아.」 이웃 나라 왕이 마부 취급을 당하자 웃음이 터지고, 망신당한 제나는 올리비아가 들고 온 등불을 낚아채 마른 짚더미에 내던진다.</w:t>
+        <w:t>그때 제나가 들어와, 눈먼 왕은 말 색도 못 볼 테니 그 흰 말은 백금발인 자기한테 어울린다고 조른다. 데미안은 올리비아가 쥐고 있던 고삐를 빼앗아 제나 손에 쥐여 준다. 마구간 앞에 궁정 사람들이 몰려들자, 제나는 고삐를 올리비아 발밑에 던지고 웃는다. 「언니가 끌어. 마부처럼.」 올리비아는 고삐를 주워 데미안의 가슴에 던진다. 「네가 끌어. 3년 동안 내 등불 들던 손이잖아.」 왕궁 최강의 기사가 마부 취급을 당하자 웃음이 터지고, 망신당한 제나는 올리비아가 들고 온 등불을 낚아채 마른 짚더미에 내던진다.</w:t>
       </w:r>
     </w:p>
     <w:p>

</xml_diff>

<commit_message>
Auto commit (2026-10-06 20:45) — 2 changes
Claude Code 세션 종료 시 자동 커밋.

Co-Authored-By: Claude <noreply@anthropic.com>
</commit_message>
<xml_diff>
--- a/projects/리메이크 러프 기획안 11종_v3.docx
+++ b/projects/리메이크 러프 기획안 11종_v3.docx
@@ -4632,7 +4632,7 @@
           <w:b w:val="0"/>
           <w:sz w:val="21"/>
         </w:rPr>
-        <w:t>절벽 위 엘프 왕궁 테라스, 둘째 공주 제나가 난간에 올라서서 눈이 멀었다는 다크 엘프 왕에게 시집갈 바엔 뛰어내리겠다고 울부짖는다. 왕비 다이앤은 딸이 하나 더 있지 않냐고 따진다. 그때 공중에 흑발의 제1공주 올리비아가 떠오른다. 타고난 백금발을 계모 손에 검게 물들여, '재앙의 흑발'로 불리는 공주다. 「죽고 싶어? 그럼 죽어.」 올리비아의 덩굴이 제나를 칭칭 감아 절벽 밖으로 내던진다. 국왕이 뻗은 정령의 바람이 떨어지는 제나를 간신히 받아 올린다. 땅에 내려선 올리비아가 아버지를 본다. 「쟤가 죽어도 싫다는 그 혼인, 내가 갈게요. 값은 제대로 치르세요.」</w:t>
+        <w:t>절벽 위 엘프 왕궁 테라스, 둘째 공주 제나가 난간에 올라 눈이 멀었다는 다크 엘프 왕에게 시집갈 바엔 뛰어내리겠다고 울부짖는다. 왕비 다이앤은 딸이 하나 더 있지 않냐고 따진다. 그때 공중에 흑발의 제1공주 올리비아가 떠오른다. 타고난 백금발을 계모 손에 검게 물들여 '재앙의 흑발'로 불리는 공주다. 「죽고 싶어? 그럼 죽어.」 올리비아의 덩굴이 제나를 칭칭 감아 절벽 밖으로 내던진다. 국왕의 정령 바람이 떨어지는 제나를 간신히 받아 올린다. 올리비아가 내려서서 아버지를 본다. 「쟤가 죽어도 싫다는 그 혼인, 내가 갈게요. 값은 제대로 치르세요.」</w:t>
       </w:r>
     </w:p>
     <w:p>
@@ -4646,7 +4646,7 @@
           <w:b w:val="0"/>
           <w:sz w:val="21"/>
         </w:rPr>
-        <w:t>3년 전, 올리비아는 왕궁 최강의 기사 데미안을 자기 호위 기사로 골랐다. 손을 잡는 순간 두 손바닥에 영혼의 반려 표식인 붉은 덩굴이 피었지만, 데미안은 자기를 살린 백금발 소녀가 흑발 공주일 리 없다며 검은 장갑으로 각인을 덮었다. 그 소녀가 올리비아이고 제나의 백금발은 마법 염색약이라는 걸 그는 모른다. 어젯밤, 3년간 그녀의 등불을 들던 그가 꺼진 복도에서 입을 맞추며 다른 이름을 불렀다. 「제나.」</w:t>
+        <w:t>3년 전, 왕국의 돈과 군대를 쥔 대공 데미안이 어린 날 자기를 살린 백금발 소녀를 찾겠다며 공주의 호위를 자청했다. 올리비아가 그의 손을 잡자 두 손바닥에 반려 표식인 붉은 덩굴이 피었지만, 데미안은 그 소녀가 흑발 공주일 리 없다며 장갑으로 각인을 덮었다. 그 소녀가 올리비아이고 제나의 백금발은 염색이라는 걸 그는 모른다. 어젯밤, 3년간 등불을 들어 주던 그가 꺼진 복도에서 입을 맞추며 다른 이름을 불렀다. 「제나.」</w:t>
       </w:r>
     </w:p>
     <w:p>
@@ -4675,7 +4675,7 @@
           <w:b w:val="0"/>
           <w:sz w:val="21"/>
         </w:rPr>
-        <w:t>다음 날 아침 궁정이 다 모인 연회장, 올리비아가 데미안의 장갑을 잡아 벗긴다. 숨겨 온 붉은 덩굴 각인이 모두 앞에 드러나고, 올리비아는 단검으로 자기 손바닥의 각인을 그어 찢는다. 「너 같은 반려는 필요 없어. 내가 먼저 버린다.」 피가 떨어지는 손으로 올리비아는 국왕 앞에 서서, 제나 대신 다크 엘프 왕국 왕비가 되겠다고 궁정 앞에서 선언한다. 궁정은 이미 계모 다이앤 손에 있어 흑발 공주의 말을 듣는 이가 없다. 귀족들은 재앙의 흑발은 흑발 다크 엘프에게나 어울린다고 웃고, 제나는 데미안의 팔에 매달려 언니가 자기를 죽이려 했다고 운다. 데미안은 올리비아의 피 흐르는 손을 내려다보며 차갑게 말한다. 「어디 가나 보자. 일주일도 못 버티고 돌아올 테니.」</w:t>
+        <w:t>다음 날 아침 궁정이 다 모인 연회장, 올리비아가 데미안의 장갑을 잡아 벗긴다. 숨겨 온 붉은 덩굴 각인이 모두 앞에 드러나고, 올리비아는 단검으로 자기 손바닥의 각인을 그어 찢는다. 「너 같은 반려는 필요 없어. 내가 먼저 버린다.」 피가 떨어지는 손으로 올리비아는 국왕 앞에 서서, 제나 대신 다크 엘프 왕국 왕비가 되겠다고 궁정 앞에서 선언한다. 재앙의 흑발 공주를 늘 무시해 온 궁정은, 이제 대공 데미안의 눈치만 본다. 귀족들은 재앙의 흑발은 흑발 다크 엘프에게나 어울린다고 웃고, 제나는 데미안의 팔에 매달려 언니가 자기를 죽이려 했다고 운다. 데미안은 올리비아의 피 흐르는 손을 내려다보며 차갑게 말한다. 「어디 가나 보자. 일주일도 못 버티고 돌아올 테니.」</w:t>
       </w:r>
     </w:p>
     <w:p>
@@ -4733,7 +4733,7 @@
           <w:b w:val="0"/>
           <w:sz w:val="21"/>
         </w:rPr>
-        <w:t>그때 제나가 들어와, 눈먼 왕은 말 색도 못 볼 테니 그 흰 말은 백금발인 자기한테 어울린다고 조른다. 데미안은 올리비아가 쥐고 있던 고삐를 빼앗아 제나 손에 쥐여 준다. 마구간 앞에 궁정 사람들이 몰려들자, 제나는 고삐를 올리비아 발밑에 던지고 웃는다. 「언니가 끌어. 마부처럼.」 올리비아는 고삐를 주워 데미안의 가슴에 던진다. 「네가 끌어. 3년 동안 내 등불 들던 손이잖아.」 왕궁 최강의 기사가 마부 취급을 당하자 웃음이 터지고, 망신당한 제나는 올리비아가 들고 온 등불을 낚아채 마른 짚더미에 내던진다.</w:t>
+        <w:t>그때 제나가 들어와, 눈먼 왕은 말 색도 못 볼 테니 그 흰 말은 백금발인 자기한테 어울린다고 조른다. 데미안은 말값의 열 배를 금화로 던져 놓고, 올리비아가 쥐고 있던 고삐를 빼앗아 제나 손에 쥐여 준다. 마구간 앞에 궁정 사람들이 몰려들자, 제나는 고삐를 올리비아 발밑에 던지고 웃는다. 「언니가 끌어. 마부처럼.」 올리비아는 고삐를 주워 데미안의 가슴에 던진다. 「네가 끌어. 3년 동안 내 등불 들던 손이잖아.」 왕국 최고의 대공이 마부 취급을 당하자 웃음이 터지고, 망신당한 제나는 올리비아가 들고 온 등불을 낚아채 마른 짚더미에 내던진다.</w:t>
       </w:r>
     </w:p>
     <w:p>

</xml_diff>

<commit_message>
Auto commit (2026-10-06 20:47) — 2 changes
Claude Code 세션 종료 시 자동 커밋.

Co-Authored-By: Claude <noreply@anthropic.com>
Claude-Session: https://claude.ai/code/b8b53fcb-f8d6-4d92-a3e9-a236c8db2489
</commit_message>
<xml_diff>
--- a/projects/리메이크 러프 기획안 11종_v3.docx
+++ b/projects/리메이크 러프 기획안 11종_v3.docx
@@ -250,7 +250,7 @@
           <w:b/>
           <w:sz w:val="21"/>
         </w:rPr>
-        <w:t>The Black-Haired Princess He Threw Away</w:t>
+        <w:t>The Black-Haired Savior He Threw Away</w:t>
       </w:r>
     </w:p>
     <w:p>
@@ -4320,7 +4320,7 @@
           <w:color w:val="1F3A5F"/>
           <w:sz w:val="34"/>
         </w:rPr>
-        <w:t>[T1] The Black-Haired Princess He Threw Away</w:t>
+        <w:t>[T1] The Black-Haired Savior He Threw Away</w:t>
       </w:r>
     </w:p>
     <w:p>
@@ -4511,7 +4511,7 @@
           <w:b w:val="0"/>
           <w:sz w:val="21"/>
         </w:rPr>
-        <w:t>계모 손에 백금발을 검게 물들여 '재앙의 흑발'로 멸시받는 엘프 공주가, 백금발로 염색한 이복동생을 어린 날 자기 목숨을 구한 소녀로 믿는 영혼의 반려를 먼저 버리고, 동생이 죽어도 싫다던 다크 엘프 왕과의 혼인을 스스로 거래해, 끝내 백금발을 되찾고 그 왕의 왕비가 되는 이야기.</w:t>
+        <w:t>계모 손에 백금발을 검게 물들여 '재앙의 흑발'로 멸시받는 엘프 공작가 맏딸이, 백금발로 염색한 이복동생을 어린 날 자기 목숨을 구한 소녀로 믿는 영혼의 반려를 먼저 버리고, 동생이 죽어도 싫다던 다크 엘프 왕과의 혼인을 스스로 거래해, 끝내 백금발을 되찾고 그 왕의 왕비가 되는 이야기.</w:t>
       </w:r>
     </w:p>
     <w:p>
@@ -4632,7 +4632,7 @@
           <w:b w:val="0"/>
           <w:sz w:val="21"/>
         </w:rPr>
-        <w:t>절벽 위 엘프 왕궁 테라스, 둘째 공주 제나가 난간에 올라 눈이 멀었다는 다크 엘프 왕에게 시집갈 바엔 뛰어내리겠다고 울부짖는다. 왕비 다이앤은 딸이 하나 더 있지 않냐고 따진다. 그때 공중에 흑발의 제1공주 올리비아가 떠오른다. 타고난 백금발을 계모 손에 검게 물들여 '재앙의 흑발'로 불리는 공주다. 「죽고 싶어? 그럼 죽어.」 올리비아의 덩굴이 제나를 칭칭 감아 절벽 밖으로 내던진다. 국왕의 정령 바람이 떨어지는 제나를 간신히 받아 올린다. 올리비아가 내려서서 아버지를 본다. 「쟤가 죽어도 싫다는 그 혼인, 내가 갈게요. 값은 제대로 치르세요.」</w:t>
+        <w:t>절벽 위 공작 저택 테라스, 공작가 둘째 딸 제나가 난간에 올라 눈이 멀었다는 다크 엘프 왕에게 시집갈 바엔 뛰어내리겠다고 울부짖는다. 공작 부인 다이앤은 딸이 하나 더 있지 않냐고 따진다. 그때 공중에 흑발의 맏딸 올리비아가 떠오른다. 타고난 백금발을 계모 손에 검게 물들여 '재앙의 흑발'로 불리는 딸이다. 「죽고 싶어? 그럼 죽어.」 올리비아의 덩굴이 제나를 칭칭 감아 절벽 밖으로 내던진다. 공작의 정령 바람이 떨어지는 제나를 간신히 받아 올린다. 올리비아가 내려서서 아버지를 본다. 「쟤가 죽어도 싫다는 그 혼인, 내가 갈게요. 값은 제대로 치르세요.」</w:t>
       </w:r>
     </w:p>
     <w:p>
@@ -4646,7 +4646,7 @@
           <w:b w:val="0"/>
           <w:sz w:val="21"/>
         </w:rPr>
-        <w:t>3년 전, 왕국의 돈과 군대를 쥔 대공 데미안이 어린 날 자기를 살린 백금발 소녀를 찾겠다며 공주의 호위를 자청했다. 올리비아가 그의 손을 잡자 두 손바닥에 반려 표식인 붉은 덩굴이 피었지만, 데미안은 그 소녀가 흑발 공주일 리 없다며 장갑으로 각인을 덮었다. 그 소녀가 올리비아이고 제나의 백금발은 염색이라는 걸 그는 모른다. 어젯밤, 3년간 등불을 들어 주던 그가 꺼진 복도에서 입을 맞추며 다른 이름을 불렀다. 「제나.」</w:t>
+        <w:t>3년 전, 엘프 왕 데미안은 어린 날 자기를 살린 백금발 소녀를 찾아 귀족 딸들의 손을 하나씩 잡았다. 올리비아의 손을 잡자 두 손바닥에 반려 표식인 붉은 덩굴이 피었지만, 데미안은 그 소녀가 흑발일 리 없다며 장갑으로 각인을 덮었다. 그 소녀가 올리비아이고 제나의 백금발은 염색이라는 걸 그는 모른다. 3년 동안 밤마다 찾아와 등불을 들어 주던 그가, 어젯밤 꺼진 복도에서 입을 맞추며 다른 이름을 불렀다. 「제나.」</w:t>
       </w:r>
     </w:p>
     <w:p>
@@ -4675,7 +4675,7 @@
           <w:b w:val="0"/>
           <w:sz w:val="21"/>
         </w:rPr>
-        <w:t>다음 날 아침 궁정이 다 모인 연회장, 올리비아가 데미안의 장갑을 잡아 벗긴다. 숨겨 온 붉은 덩굴 각인이 모두 앞에 드러나고, 올리비아는 단검으로 자기 손바닥의 각인을 그어 찢는다. 「너 같은 반려는 필요 없어. 내가 먼저 버린다.」 피가 떨어지는 손으로 올리비아는 국왕 앞에 서서, 제나 대신 다크 엘프 왕국 왕비가 되겠다고 궁정 앞에서 선언한다. 재앙의 흑발 공주를 늘 무시해 온 궁정은, 이제 대공 데미안의 눈치만 본다. 귀족들은 재앙의 흑발은 흑발 다크 엘프에게나 어울린다고 웃고, 제나는 데미안의 팔에 매달려 언니가 자기를 죽이려 했다고 운다. 데미안은 올리비아의 피 흐르는 손을 내려다보며 차갑게 말한다. 「어디 가나 보자. 일주일도 못 버티고 돌아올 테니.」</w:t>
+        <w:t>다음 날 아침 왕궁 연회장, 올리비아가 데미안의 장갑을 잡아 벗긴다. 숨겨 온 붉은 덩굴 각인이 모두 앞에 드러나고, 올리비아는 단검으로 자기 손바닥의 각인을 그어 찢는다. 「너 같은 반려는 필요 없어. 내가 먼저 버린다.」 피가 떨어지는 손으로 올리비아는 아버지 공작 앞에 서서, 제나 대신 다크 엘프 왕국 왕비가 되겠다고 궁정 앞에서 선언한다. 귀족들은 재앙의 흑발은 흑발 다크 엘프에게나 어울린다고 웃고, 제나는 데미안의 팔에 매달려 언니가 자기를 죽이려 했다고 운다. 데미안은 올리비아의 피 흐르는 손을 내려다보며 차갑게 말한다. 「어디 가나 보자. 일주일도 못 버티고 돌아올 테니.」</w:t>
       </w:r>
     </w:p>
     <w:p>
@@ -4704,7 +4704,7 @@
           <w:b w:val="0"/>
           <w:sz w:val="21"/>
         </w:rPr>
-        <w:t>그날 밤 데미안은 부관이 가져온, 영원히 꺼지지 않는 정령 보석을 제나의 생일 선물로 받아 든다. 어린 날 숲에서 독에 쓰러졌을 때 백금발 소녀가 입으로 독을 빨아냈다. 어머니가 죽은 뒤 계모가 그 백금발을 검게 물들였고, 올리비아가 씻어 낼 때마다 국왕은 계모 말만 듣고 딸을 때렸다는 걸 그는 모른다. 다음 날 마구간, 올리비아는 다크 엘프 왕국으로 타고 갈 흰 말의 갈기에 혼례 리본을 땋고 있다. 따라온 데미안이 갈 생각도 없으면서 쇼하지 말라고 비웃자, 올리비아는 마지막 리본을 꽉 묶는다. 「착각하지 마. 다음 달이면 나, 다크 엘프 왕국 왕비야.」</w:t>
+        <w:t>그날 밤 데미안은 부관이 가져온, 영원히 꺼지지 않는 정령 보석을 제나의 생일 선물로 받아 든다. 어린 날 숲에서 독에 쓰러졌을 때 백금발 소녀가 입으로 독을 빨아냈다. 어머니가 죽은 뒤 계모가 그 백금발을 검게 물들였고, 올리비아가 씻어 낼 때마다 공작은 계모 말만 듣고 딸을 때렸다는 걸 그는 모른다. 다음 날 마구간, 올리비아는 다크 엘프 왕국으로 타고 갈 흰 말의 갈기에 혼례 리본을 땋고 있다. 따라온 데미안이 갈 생각도 없으면서 쇼하지 말라고 비웃자, 올리비아는 마지막 리본을 꽉 묶는다. 「착각하지 마. 다음 달이면 나, 다크 엘프 왕국 왕비야.」</w:t>
       </w:r>
     </w:p>
     <w:p>
@@ -4733,7 +4733,7 @@
           <w:b w:val="0"/>
           <w:sz w:val="21"/>
         </w:rPr>
-        <w:t>그때 제나가 들어와, 눈먼 왕은 말 색도 못 볼 테니 그 흰 말은 백금발인 자기한테 어울린다고 조른다. 데미안은 말값의 열 배를 금화로 던져 놓고, 올리비아가 쥐고 있던 고삐를 빼앗아 제나 손에 쥐여 준다. 마구간 앞에 궁정 사람들이 몰려들자, 제나는 고삐를 올리비아 발밑에 던지고 웃는다. 「언니가 끌어. 마부처럼.」 올리비아는 고삐를 주워 데미안의 가슴에 던진다. 「네가 끌어. 3년 동안 내 등불 들던 손이잖아.」 왕국 최고의 대공이 마부 취급을 당하자 웃음이 터지고, 망신당한 제나는 올리비아가 들고 온 등불을 낚아채 마른 짚더미에 내던진다.</w:t>
+        <w:t>그때 제나가 들어와, 눈먼 왕은 말 색도 못 볼 테니 그 흰 말은 백금발인 자기한테 어울린다고 조른다. 데미안은 올리비아가 쥐고 있던 고삐를 빼앗아 제나 손에 쥐여 준다. 마구간 앞에 사람들이 몰려들자, 제나는 고삐를 올리비아 발밑에 던지고 웃는다. 「언니가 끌어. 마부처럼.」 올리비아는 고삐를 주워 데미안의 가슴에 던진다. 「네가 끌어. 3년 동안 내 등불 들던 손이잖아.」 엘프 왕이 마부 취급을 당하자 웃음이 터지고, 망신당한 제나는 올리비아가 들고 온 등불을 낚아채 마른 짚더미에 내던진다.</w:t>
       </w:r>
     </w:p>
     <w:p>

</xml_diff>

<commit_message>
Auto commit (2026-10-06 20:49) — 2 changes
Claude Code 세션 종료 시 자동 커밋.

Co-Authored-By: Claude <noreply@anthropic.com>
</commit_message>
<xml_diff>
--- a/projects/리메이크 러프 기획안 11종_v3.docx
+++ b/projects/리메이크 러프 기획안 11종_v3.docx
@@ -250,7 +250,7 @@
           <w:b/>
           <w:sz w:val="21"/>
         </w:rPr>
-        <w:t>The Black-Haired Savior He Threw Away</w:t>
+        <w:t>The True Love He Threw Away</w:t>
       </w:r>
     </w:p>
     <w:p>
@@ -4320,7 +4320,7 @@
           <w:color w:val="1F3A5F"/>
           <w:sz w:val="34"/>
         </w:rPr>
-        <w:t>[T1] The Black-Haired Savior He Threw Away</w:t>
+        <w:t>[T1] The True Love He Threw Away</w:t>
       </w:r>
     </w:p>
     <w:p>
@@ -4632,7 +4632,7 @@
           <w:b w:val="0"/>
           <w:sz w:val="21"/>
         </w:rPr>
-        <w:t>절벽 위 공작 저택 테라스, 공작가 둘째 딸 제나가 난간에 올라 눈이 멀었다는 다크 엘프 왕에게 시집갈 바엔 뛰어내리겠다고 울부짖는다. 공작 부인 다이앤은 딸이 하나 더 있지 않냐고 따진다. 그때 공중에 흑발의 맏딸 올리비아가 떠오른다. 타고난 백금발을 계모 손에 검게 물들여 '재앙의 흑발'로 불리는 딸이다. 「죽고 싶어? 그럼 죽어.」 올리비아의 덩굴이 제나를 칭칭 감아 절벽 밖으로 내던진다. 공작의 정령 바람이 떨어지는 제나를 간신히 받아 올린다. 올리비아가 내려서서 아버지를 본다. 「쟤가 죽어도 싫다는 그 혼인, 내가 갈게요. 값은 제대로 치르세요.」</w:t>
+        <w:t>공작 저택 절벽 테라스, 둘째 딸 제나가 난간에 올라 눈이 멀었다는 다크 엘프 왕에게 시집갈 바엔 뛰어내리겠다고 울부짖는다. 계모 다이앤은 딸이 하나 더 있지 않냐고 따진다. 그때 공중에 흑발의 맏딸 올리비아가 떠오른다. 타고난 백금발을 계모 손에 검게 물들여 '재앙의 흑발'로 불리는 딸이다. 「죽고 싶어? 그럼 죽어.」 올리비아의 덩굴이 제나를 감아 절벽 밖으로 내던진다. 공작의 정령 바람이 떨어지는 제나를 간신히 받아 올린다. 올리비아가 아버지를 본다. 「쟤가 죽어도 싫다는 그 혼인, 내가 갈게요. 값은 제대로 치르세요.」</w:t>
       </w:r>
     </w:p>
     <w:p>
@@ -4646,7 +4646,7 @@
           <w:b w:val="0"/>
           <w:sz w:val="21"/>
         </w:rPr>
-        <w:t>3년 전, 엘프 왕 데미안은 어린 날 자기를 살린 백금발 소녀를 찾아 귀족 딸들의 손을 하나씩 잡았다. 올리비아의 손을 잡자 두 손바닥에 반려 표식인 붉은 덩굴이 피었지만, 데미안은 그 소녀가 흑발일 리 없다며 장갑으로 각인을 덮었다. 그 소녀가 올리비아이고 제나의 백금발은 염색이라는 걸 그는 모른다. 3년 동안 밤마다 찾아와 등불을 들어 주던 그가, 어젯밤 꺼진 복도에서 입을 맞추며 다른 이름을 불렀다. 「제나.」</w:t>
+        <w:t>3년 전, 엘프 왕자 데미안이 어린 날 자기를 살린 백금발 소녀를 찾겠다며 공작가 호위를 자청했다. 올리비아가 그를 골라 손을 잡자, 두 손바닥에 영혼의 반려에게만 피는 붉은 덩굴이 떠올랐다. 데미안은 그 소녀가 흑발일 리 없다며 장갑으로 각인을 덮었다. 그 소녀가 올리비아이고 제나의 백금발은 염색이라는 걸 그는 모른다. 3년간 밤마다 올리비아의 등불을 들어 준 그가, 어젯밤 불 꺼진 복도에서 그녀를 제나로 알고 끌어안았다. 「제나, 사랑해.」</w:t>
       </w:r>
     </w:p>
     <w:p>
@@ -4733,7 +4733,7 @@
           <w:b w:val="0"/>
           <w:sz w:val="21"/>
         </w:rPr>
-        <w:t>그때 제나가 들어와, 눈먼 왕은 말 색도 못 볼 테니 그 흰 말은 백금발인 자기한테 어울린다고 조른다. 데미안은 올리비아가 쥐고 있던 고삐를 빼앗아 제나 손에 쥐여 준다. 마구간 앞에 사람들이 몰려들자, 제나는 고삐를 올리비아 발밑에 던지고 웃는다. 「언니가 끌어. 마부처럼.」 올리비아는 고삐를 주워 데미안의 가슴에 던진다. 「네가 끌어. 3년 동안 내 등불 들던 손이잖아.」 엘프 왕이 마부 취급을 당하자 웃음이 터지고, 망신당한 제나는 올리비아가 들고 온 등불을 낚아채 마른 짚더미에 내던진다.</w:t>
+        <w:t>그때 제나가 들어와, 눈먼 왕은 말 색도 못 볼 테니 그 흰 말은 백금발인 자기한테 어울린다고 조른다. 데미안은 올리비아가 쥐고 있던 고삐를 빼앗아 제나 손에 쥐여 준다. 마구간 앞에 사람들이 몰려들자, 제나는 고삐를 올리비아 발밑에 던지고 웃는다. 「언니가 끌어. 마부처럼.」 올리비아는 고삐를 주워 데미안의 가슴에 던진다. 「네가 끌어. 3년 동안 내 등불 들던 손이잖아.」 엘프 왕자가 마부 취급을 당하자 웃음이 터지고, 망신당한 제나는 올리비아가 들고 온 등불을 낚아채 마른 짚더미에 내던진다.</w:t>
       </w:r>
     </w:p>
     <w:p>

</xml_diff>

<commit_message>
Auto commit (2026-10-06 20:57) — 2 changes
Claude Code 세션 종료 시 자동 커밋.

Co-Authored-By: Claude <noreply@anthropic.com>
</commit_message>
<xml_diff>
--- a/projects/리메이크 러프 기획안 11종_v3.docx
+++ b/projects/리메이크 러프 기획안 11종_v3.docx
@@ -250,7 +250,7 @@
           <w:b/>
           <w:sz w:val="21"/>
         </w:rPr>
-        <w:t>The True Love He Threw Away</w:t>
+        <w:t>The Black-Haired Love He Threw Away</w:t>
       </w:r>
     </w:p>
     <w:p>
@@ -4320,7 +4320,7 @@
           <w:color w:val="1F3A5F"/>
           <w:sz w:val="34"/>
         </w:rPr>
-        <w:t>[T1] The True Love He Threw Away</w:t>
+        <w:t>[T1] The Black-Haired Love He Threw Away</w:t>
       </w:r>
     </w:p>
     <w:p>
@@ -4632,7 +4632,7 @@
           <w:b w:val="0"/>
           <w:sz w:val="21"/>
         </w:rPr>
-        <w:t>공작 저택 절벽 테라스, 둘째 딸 제나가 난간에 올라 눈이 멀었다는 다크 엘프 왕에게 시집갈 바엔 뛰어내리겠다고 울부짖는다. 계모 다이앤은 딸이 하나 더 있지 않냐고 따진다. 그때 공중에 흑발의 맏딸 올리비아가 떠오른다. 타고난 백금발을 계모 손에 검게 물들여 '재앙의 흑발'로 불리는 딸이다. 「죽고 싶어? 그럼 죽어.」 올리비아의 덩굴이 제나를 감아 절벽 밖으로 내던진다. 공작의 정령 바람이 떨어지는 제나를 간신히 받아 올린다. 올리비아가 아버지를 본다. 「쟤가 죽어도 싫다는 그 혼인, 내가 갈게요. 값은 제대로 치르세요.」</w:t>
+        <w:t>공작 저택 절벽 테라스. 둘째 딸 제나가 난간 위에서, 눈이 멀었다는 다크 엘프 왕에게 시집가느니 뛰어내리겠다고 울부짖는다. 계모 다이앤은 딸을 붙들고 남편 공작을 몰아세운다. 이 집에 딸이 제나 하나뿐이냐고. 그때 맏딸 올리비아가 덩굴을 타고 공중에서 내려선다. 타고난 백금발을 계모 손에 검게 물들인 채 '재앙의 흑발'이라 손가락질받으며 자란 딸이다. 「죽고 싶어? 그럼 죽어.」 올리비아의 덩굴이 제나를 휘감아 절벽 아래로 내던진다. 공작이 다급히 정령 바람을 날려, 바위에 부딪히기 직전의 제나를 겨우 끌어 올린다. 올리비아가 아버지를 돌아본다. 「쟤가 죽어도 싫다는 그 혼인, 내가 갈게요. 값은 제대로 치르세요.」</w:t>
       </w:r>
     </w:p>
     <w:p>
@@ -4646,7 +4646,7 @@
           <w:b w:val="0"/>
           <w:sz w:val="21"/>
         </w:rPr>
-        <w:t>3년 전, 엘프 왕자 데미안이 어린 날 자기를 살린 백금발 소녀를 찾겠다며 공작가 호위를 자청했다. 올리비아가 그를 골라 손을 잡자, 두 손바닥에 영혼의 반려에게만 피는 붉은 덩굴이 떠올랐다. 데미안은 그 소녀가 흑발일 리 없다며 장갑으로 각인을 덮었다. 그 소녀가 올리비아이고 제나의 백금발은 염색이라는 걸 그는 모른다. 3년간 밤마다 올리비아의 등불을 들어 준 그가, 어젯밤 불 꺼진 복도에서 그녀를 제나로 알고 끌어안았다. 「제나, 사랑해.」</w:t>
+        <w:t>올리비아가 이 집을 떠나기로 한 건 어젯밤 때문이다. 3년 전, 어린 날 자기를 살린 백금발 소녀를 찾던 엘프 왕자 데미안이 공작가 호위를 자청했고, 올리비아가 그를 골랐다. 손이 닿자 둘의 손바닥에 영혼의 반려에게만 피는 붉은 덩굴이 떠올랐지만, 데미안은 흑발 여자가 그 소녀일 리 없다며 장갑으로 덮었다. 그 소녀가 올리비아라는 걸 그는 모른다. 3년 동안 밤마다 등불을 들고 곁을 지킨 그를, 올리비아는 사랑했다. 그런데 어젯밤 불 꺼진 복도에서, 그녀를 끌어안은 그가 속삭였다. 「제나, 사랑해.」</w:t>
       </w:r>
     </w:p>
     <w:p>
@@ -4675,7 +4675,7 @@
           <w:b w:val="0"/>
           <w:sz w:val="21"/>
         </w:rPr>
-        <w:t>다음 날 아침 왕궁 연회장, 올리비아가 데미안의 장갑을 잡아 벗긴다. 숨겨 온 붉은 덩굴 각인이 모두 앞에 드러나고, 올리비아는 단검으로 자기 손바닥의 각인을 그어 찢는다. 「너 같은 반려는 필요 없어. 내가 먼저 버린다.」 피가 떨어지는 손으로 올리비아는 아버지 공작 앞에 서서, 제나 대신 다크 엘프 왕국 왕비가 되겠다고 궁정 앞에서 선언한다. 귀족들은 재앙의 흑발은 흑발 다크 엘프에게나 어울린다고 웃고, 제나는 데미안의 팔에 매달려 언니가 자기를 죽이려 했다고 운다. 데미안은 올리비아의 피 흐르는 손을 내려다보며 차갑게 말한다. 「어디 가나 보자. 일주일도 못 버티고 돌아올 테니.」</w:t>
+        <w:t>다음 날 아침 왕궁 연회장. 올리비아는 모두가 보는 앞에서 데미안의 손을 잡아 장갑을 벗긴다. 3년 동안 숨겨 온 붉은 덩굴이 드러나자 연회장이 술렁이고, 올리비아는 그 앞에서 단검으로 자기 손바닥의 덩굴을 그어 찢는다. 「너 같은 반려는 필요 없어. 내가 먼저 버린다.」 피가 떨어지는 손으로 아버지 앞에 선 올리비아는, 제나 대신 다크 엘프 왕국의 왕비가 되겠다고 선언한다. 귀족들은 재앙의 흑발에겐 눈먼 왕이 딱이라며 비웃고, 제나는 데미안 품에 파고들어 언니가 자기를 죽이려 했다고 운다. 제나를 감싸 안은 데미안은, 버림받은 쪽이 자기라는 게 믿기지 않는 얼굴로 올리비아를 본다. 「어디 가나 보자. 일주일도 못 버티고 돌아올 테니.」</w:t>
       </w:r>
     </w:p>
     <w:p>
@@ -4704,7 +4704,7 @@
           <w:b w:val="0"/>
           <w:sz w:val="21"/>
         </w:rPr>
-        <w:t>그날 밤 데미안은 부관이 가져온, 영원히 꺼지지 않는 정령 보석을 제나의 생일 선물로 받아 든다. 어린 날 숲에서 독에 쓰러졌을 때 백금발 소녀가 입으로 독을 빨아냈다. 어머니가 죽은 뒤 계모가 그 백금발을 검게 물들였고, 올리비아가 씻어 낼 때마다 공작은 계모 말만 듣고 딸을 때렸다는 걸 그는 모른다. 다음 날 마구간, 올리비아는 다크 엘프 왕국으로 타고 갈 흰 말의 갈기에 혼례 리본을 땋고 있다. 따라온 데미안이 갈 생각도 없으면서 쇼하지 말라고 비웃자, 올리비아는 마지막 리본을 꽉 묶는다. 「착각하지 마. 다음 달이면 나, 다크 엘프 왕국 왕비야.」</w:t>
+        <w:t>그날 밤 데미안은 영원히 꺼지지 않는 정령 보석을 손에 쥐고 있다. 제나의 생일에 줄 선물이다. 보석의 빛을 보며 그는 어린 날 숲을 떠올린다. 독화살에 쓰러진 그에게 달려온 백금발 소녀가 입으로 독을 빨아내 주었고, 데미안은 그 소녀가 제나라고 믿는다. 그 소녀가 올리비아였고, 어머니가 죽은 뒤 계모가 그 백금발을 검게 물들였으며, 올리비아가 물을 씻어 낼 때마다 공작이 계모 말만 듣고 딸을 때렸다는 걸 그는 모른다. 다음 날 마구간, 올리비아는 다크 엘프 왕국까지 타고 갈 흰 말의 갈기에 혼례 리본을 땋는다. 따라온 데미안이 갈 생각도 없으면서 자기 마음을 끌려고 쇼한다고 비웃자, 올리비아는 그를 보지도 않고 마지막 리본을 꽉 묶는다. 「착각하지 마. 다음 달이면 나, 다크 엘프 왕국 왕비야.」</w:t>
       </w:r>
     </w:p>
     <w:p>
@@ -4733,7 +4733,7 @@
           <w:b w:val="0"/>
           <w:sz w:val="21"/>
         </w:rPr>
-        <w:t>그때 제나가 들어와, 눈먼 왕은 말 색도 못 볼 테니 그 흰 말은 백금발인 자기한테 어울린다고 조른다. 데미안은 올리비아가 쥐고 있던 고삐를 빼앗아 제나 손에 쥐여 준다. 마구간 앞에 사람들이 몰려들자, 제나는 고삐를 올리비아 발밑에 던지고 웃는다. 「언니가 끌어. 마부처럼.」 올리비아는 고삐를 주워 데미안의 가슴에 던진다. 「네가 끌어. 3년 동안 내 등불 들던 손이잖아.」 엘프 왕자가 마부 취급을 당하자 웃음이 터지고, 망신당한 제나는 올리비아가 들고 온 등불을 낚아채 마른 짚더미에 내던진다.</w:t>
+        <w:t>데미안의 얼굴이 굳는 사이, 제나가 마구간으로 들어온다. 제나는 흰 말의 갈기를 쓰다듬으며, 눈먼 왕은 말 색도 못 볼 테니 이 말은 백금발인 자기가 타야 어울린다고 조른다. 데미안은 망설임 없이 올리비아 손에서 고삐를 빼앗아 제나에게 쥐여 준다. 구경하러 몰려든 하인과 귀족들 앞에서, 제나는 그 고삐를 올리비아 발밑에 던진다. 「언니가 끌어. 마부처럼.」 사람들이 킥킥대는 가운데, 올리비아는 천천히 고삐를 주워 데미안의 가슴팍에 던진다. 「네가 끌어. 3년 동안 내 등불 들던 손이잖아.」 왕자가 마부 취급을 당하자 웃음이 터진다. 얼굴이 새빨개진 제나는 올리비아가 들고 온 등불을 낚아채, 마른 짚더미에 내던진다.</w:t>
       </w:r>
     </w:p>
     <w:p>
@@ -4762,7 +4762,7 @@
           <w:b w:val="0"/>
           <w:sz w:val="21"/>
         </w:rPr>
-        <w:t>불길이 순식간에 마구간 지붕까지 번지고, 연기 속에서 검은 복면의 자객들이 칼을 뽑아 든다. 혼례 전에 올리비아를 없애라고 계모 다이앤이 풀어 둔 자들이다. 기둥에 다리가 깔린 올리비아를 자객들이 에워싸고, 반대편 칸에서는 연기에 갇힌 제나가 비명을 지른다. 불 속으로 뛰어든 데미안 앞에서 지붕이 무너지며 길이 하나만 남는다. 칼날 앞의 올리비아와 불 속의 제나, 한 사람만 데리고 나갈 수 있다. 올리비아는 살려 달라는 말 대신 데미안의 눈을 똑바로 본다. 「누구한테 가는지, 내가 똑똑히 볼 거야.」 데미안은 그 눈을 피해 제나를 안아 들고, 불길 밖으로 달려 나간다.</w:t>
+        <w:t>짚에 붙은 불이 순식간에 마구간 지붕까지 치솟고, 연기 속에서 검은 복면의 자객들이 칼을 뽑는다. 혼례 전에 올리비아를 없애라고 계모 다이앤이 몰래 심어 둔 자들이다. 무너진 기둥에 다리가 깔린 올리비아를 자객들이 에워싸고, 반대편 칸에서는 연기에 갇힌 제나가 데미안을 부르며 비명을 지른다. 불 속으로 뛰어든 데미안 앞에서 지붕이 무너져, 빠져나갈 길이 하나만 남는다. 칼날에 둘러싸인 올리비아와 연기 속의 제나, 둘 중 한 사람만 데리고 나갈 수 있다. 올리비아는 살려 달라고 하지 않는다. 그 대신 데미안의 눈을 똑바로 본다. 「누구한테 가는지, 내가 똑똑히 볼 거야.」 데미안은 그 눈을 피해 제나를 안아 들고, 불길 밖으로 달려 나간다.</w:t>
       </w:r>
     </w:p>
     <w:p>
@@ -4791,7 +4791,7 @@
           <w:b w:val="0"/>
           <w:sz w:val="21"/>
         </w:rPr>
-        <w:t>남겨진 올리비아에게 자객들의 칼이 쏟아진다. 팔이 베이고 뺨이 갈라져도, 올리비아는 깔린 다리를 끌어내 단검 하나로 버티다 피투성이로 쓰러진다. 마지막 칼날이 내려오는 순간, 그녀의 몸에서 은빛 정령력이 터져 자객들을 날려 버리고 불길을 통째로 삼킨다. 불빛에 그을린 머리끝 한 가닥이 백금빛으로 번뜩인다. 그 빛을 보고 돌아온 데미안이 무릎을 꿇지만, 올리비아는 눈을 감는다. 「이미 골랐잖아. 이제 와서 걱정하는 척하지 마.」 그때 녹아내린 염색약을 망토로 가린 제나가 긁힌 팔을 내밀며 언니 때문에 다쳤다고 울고, 데미안은 다시 제나를 안아 든다. 같은 시각, 눈을 검은 비단으로 가린 흑발의 다크 엘프 왕 가브리엘이 신부가 피투성이가 됐다는 보고를 받고 눈가리개를 푼다. 멀쩡한 두 눈이 서늘하다. 「말 준비해. 내 왕비는 내가 데려온다.」</w:t>
+        <w:t>혼자 남은 올리비아에게 자객들의 칼이 쏟아진다. 팔이 베이고 뺨이 갈라져도 올리비아는 깔린 다리를 빼내 단검 하나로 버티지만, 끝내 피투성이로 쓰러진다. 마지막 칼날이 목을 향해 내려오는 순간, 올리비아의 몸에서 은빛 정령력이 터져 자객들을 날려 버리고 불길까지 한꺼번에 삼킨다. 그을린 머리끝 한 가닥이 백금빛으로 번뜩인다. 그 빛을 보고 돌아온 데미안이 무릎을 꿇지만, 올리비아는 눈을 감는다. 「이미 골랐잖아. 이제 와서 걱정하는 척하지 마.」 그때 녹아 흘러내린 염색약을 망토로 가린 제나가 긁힌 팔을 내밀며 언니 때문에 다쳤다고 울고, 데미안은 또다시 제나를 안아 든다. 같은 시각, 엘프 가운데 가장 강하다는 흑발의 다크 엘프 왕 가브리엘이 신부가 피투성이가 됐다는 보고를 받는다. 그가 늘 두르던 검은 눈가리개를 풀자, 멀었다던 두 눈이 멀쩡하게 빛난다. 「말 준비해. 내 왕비는 내가 데려온다.」</w:t>
       </w:r>
     </w:p>
     <w:p>
@@ -4820,7 +4820,7 @@
           <w:b w:val="0"/>
           <w:sz w:val="21"/>
         </w:rPr>
-        <w:t>사흘 뒤 제나의 생일 연회, 뺨에 칼자국이 남은 채 다리를 절며 들어선 올리비아를 하객들이 방화범이라 손가락질한다. 데미안은 꺼지지 않는 정령 보석을 제나 목에 걸어 주고, 하객들은 진짜 구원자에게 어울리는 선물이라며 박수를 친다. 그때 제나가 작은 유리병 하나를 꺼내 흔든다. 올리비아의 혼례 짐에서 몰래 빼낸, 어머니가 숨을 거두며 남긴 마지막 정령수다. 올리비아가 돌려 달라고 다가서자 데미안이 막아선다. 제나에게 사과하고, 불붙은 유리 등불을 맨손으로 감싸 쥔 채 불이 다 꺼질 때까지 버티면 병을 돌려주겠다고 한다. 제나가 등불을 내밀며 웃는다. 「오늘도 내 등불 들고 서 있어 봐.」</w:t>
+        <w:t>사흘 뒤 제나의 생일 연회. 뺨에 칼자국이 남은 채 다리를 절며 들어선 올리비아를, 하객들은 마구간에 불을 지른 범인이라며 손가락질한다. 데미안은 그 앞에서 꺼지지 않는 정령 보석을 제나 목에 걸어 주고, 하객들은 진짜 구원자에게 어울리는 선물이라며 손뼉을 친다. 그때 제나가 작은 유리병을 꺼내 흔든다. 올리비아의 혼례 짐에서 몰래 빼낸, 돌아가신 어머니가 마지막 숨으로 채워 남긴 정령수다. 올리비아가 돌려 달라며 다가서자 데미안이 앞을 막는다. 제나에게 사과하고, 불붙은 유리 등불을 맨손으로 감싸 쥔 채 불이 다 꺼질 때까지 버티면 돌려주겠다는 것이다. 제나가 웃으며 등불을 내민다. 「언니, 오늘도 내 등불 들고 서 있어 봐.」</w:t>
       </w:r>
     </w:p>
     <w:p>
@@ -4849,7 +4849,7 @@
           <w:b w:val="0"/>
           <w:sz w:val="21"/>
         </w:rPr>
-        <w:t>올리비아는 등불을 받아 들고 데미안을 본다. 「들게. 대신 불은 네가 붙여.」 데미안이 불을 붙이자 유리가 달아오르며 올리비아의 손바닥이 타들어 간다. 그런데 비틀거리는 건 데미안이다. 찢어도 남아 있던 각인 때문에 그녀의 고통이 장갑 속 그의 손바닥으로 그대로 건너온다. 데미안은 이를 악물고 주먹을 쥔 채 버티고, 올리비아는 눈 하나 깜빡하지 않는다. 불이 꺼지자 올리비아는 등불을 바닥에 내려놓는다. 「다 탔어. 사과는 불 지른 사람이 해.」 올리비아가 병으로 손을 뻗는 순간, 제나가 먼저 병을 낚아챈다.</w:t>
+        <w:t>올리비아는 등불을 받아 들고 데미안을 똑바로 본다. 「들게. 대신 불은 네가 붙여.」 데미안이 불을 붙이자 유리가 달아오르고, 올리비아의 손바닥이 타들어 간다. 그런데 이를 악물고 비틀거리는 건 데미안이다. 찢어도 다 지워지지 않은 덩굴 때문에, 올리비아의 고통이 장갑 속 그의 손바닥으로 그대로 건너온 것이다. 데미안은 주먹을 쥐고 버티고, 올리비아는 눈 하나 깜빡하지 않는다. 마침내 불이 꺼지자 올리비아는 새까맣게 탄 손으로 등불을 내려놓는다. 「다 탔어. 사과는 불 지른 사람이 해.」 그리고 어머니의 병으로 손을 뻗는 순간, 제나가 한발 먼저 병을 낚아챈다.</w:t>
       </w:r>
     </w:p>
     <w:p>
@@ -4878,7 +4878,7 @@
           <w:b w:val="0"/>
           <w:sz w:val="21"/>
         </w:rPr>
-        <w:t>제나는 검게 물든 머리에 엄마 물 따위가 무슨 소용이냐며 병을 바닥에 내리쳐 깨뜨린다. 흩어진 정령수가 마지막 빛을 내다 꺼지는 걸 본 순간, 올리비아가 제나의 머리채를 잡아 바닥에 처박는다. 데미안이 달려들어 장갑 낀 손으로 올리비아의 목을 움켜쥐고 떼어 낸다. 숨이 막혀 가는 올리비아가 그를 노려본다. 「잘 기억해. 지금 네가 목 조르는 여자가, 그날 숲에서 네 목숨 살린 그 아이야.」 그 순간 연회장 문이 부서지고, 들어온 남자가 데미안의 팔을 꺾어 떼어 내고 올리비아를 안아 올린다. 눈이 멀었다던 다크 엘프 왕 가브리엘이 데미안을 똑바로 본다. 「감히 누구 신부를 건드려! 절대 가만두지 않겠다!」</w:t>
+        <w:t>제나는 검게 물든 머리로 엄마 물 따위를 가져서 뭐 하냐며, 병을 바닥에 내리쳐 깨뜨린다. 흩어진 정령수가 마지막 빛을 내다 꺼지는 걸 본 순간, 참아 왔던 올리비아의 분노가 터진다. 올리비아는 제나의 머리채를 잡아 바닥에 처박는다. 데미안이 달려들어 장갑 낀 손으로 올리비아의 목을 움켜쥐고 떼어 낸다. 숨이 막혀 얼굴이 하얗게 질리면서도, 올리비아는 그를 노려본다. 「잘 기억해. 지금 네가 목 조르는 여자가, 그날 숲에서 네 목숨 살린 그 아이야.」 데미안의 손이 멈칫하는 순간, 연회장 문이 부서지며 한 남자가 들어선다. 그는 데미안의 팔을 꺾어 떼어 내고, 쓰러지는 올리비아를 품에 안는다. 눈이 멀었다던 다크 엘프 왕 가브리엘이 데미안을 내려다본다. 「감히 누구 신부를 건드려! 절대 가만두지 않겠다!」</w:t>
       </w:r>
     </w:p>
     <w:p>

</xml_diff>

<commit_message>
Auto commit (2026-10-06 20:59) — 2 changes
Claude Code 세션 종료 시 자동 커밋.

Co-Authored-By: Claude <noreply@anthropic.com>
Claude-Session: https://claude.ai/code/b8b53fcb-f8d6-4d92-a3e9-a236c8db2489
</commit_message>
<xml_diff>
--- a/projects/리메이크 러프 기획안 11종_v3.docx
+++ b/projects/리메이크 러프 기획안 11종_v3.docx
@@ -4646,7 +4646,7 @@
           <w:b w:val="0"/>
           <w:sz w:val="21"/>
         </w:rPr>
-        <w:t>올리비아가 이 집을 떠나기로 한 건 어젯밤 때문이다. 3년 전, 어린 날 자기를 살린 백금발 소녀를 찾던 엘프 왕자 데미안이 공작가 호위를 자청했고, 올리비아가 그를 골랐다. 손이 닿자 둘의 손바닥에 영혼의 반려에게만 피는 붉은 덩굴이 떠올랐지만, 데미안은 흑발 여자가 그 소녀일 리 없다며 장갑으로 덮었다. 그 소녀가 올리비아라는 걸 그는 모른다. 3년 동안 밤마다 등불을 들고 곁을 지킨 그를, 올리비아는 사랑했다. 그런데 어젯밤 불 꺼진 복도에서, 그녀를 끌어안은 그가 속삭였다. 「제나, 사랑해.」</w:t>
+        <w:t>올리비아가 이 집을 떠나기로 한 건 어젯밤 때문이다. 3년 전, 어린 날 자기를 살린 백금발 소녀를 찾던 엘프 왕자 데미안이 공작가 호위를 자청했고, 올리비아가 그를 골랐다. 손이 닿자 둘의 손바닥에 영혼의 반려에게만 피는 붉은 덩굴이 떠올랐지만, 데미안은 흑발 여자가 그 소녀일 리 없다며 장갑으로 덮었다. 그 소녀가 올리비아라는 걸 그는 모른다. 3년 동안 매일 아침 손끝으로 정령 꽃을 피워 그녀 머리에 꽂아 주던 그를, 올리비아는 사랑했다. 그리고 어젯밤 두 영혼을 잇는 결속 의식, 붉은 덩굴이 두 사람을 감아 오르던 순간 데미안이 입술을 대려다 다른 여자의 이름을 불렀다. 「제나.」 덩굴이 시들어 바스러졌다.</w:t>
       </w:r>
     </w:p>
     <w:p>
@@ -4733,7 +4733,7 @@
           <w:b w:val="0"/>
           <w:sz w:val="21"/>
         </w:rPr>
-        <w:t>데미안의 얼굴이 굳는 사이, 제나가 마구간으로 들어온다. 제나는 흰 말의 갈기를 쓰다듬으며, 눈먼 왕은 말 색도 못 볼 테니 이 말은 백금발인 자기가 타야 어울린다고 조른다. 데미안은 망설임 없이 올리비아 손에서 고삐를 빼앗아 제나에게 쥐여 준다. 구경하러 몰려든 하인과 귀족들 앞에서, 제나는 그 고삐를 올리비아 발밑에 던진다. 「언니가 끌어. 마부처럼.」 사람들이 킥킥대는 가운데, 올리비아는 천천히 고삐를 주워 데미안의 가슴팍에 던진다. 「네가 끌어. 3년 동안 내 등불 들던 손이잖아.」 왕자가 마부 취급을 당하자 웃음이 터진다. 얼굴이 새빨개진 제나는 올리비아가 들고 온 등불을 낚아채, 마른 짚더미에 내던진다.</w:t>
+        <w:t>데미안의 얼굴이 굳는 사이, 제나가 마구간으로 들어온다. 제나는 흰 말의 갈기를 쓰다듬으며, 눈먼 왕은 말 색도 못 볼 테니 이 말은 백금발인 자기가 타야 어울린다고 조른다. 데미안은 망설임 없이 올리비아 손에서 고삐를 빼앗아 제나에게 쥐여 준다. 구경하러 몰려든 하인과 귀족들 앞에서, 제나는 그 고삐를 올리비아 발밑에 던진다. 「언니가 끌어. 마부처럼.」 사람들이 킥킥대는 가운데, 올리비아는 천천히 고삐를 주워 데미안의 가슴팍에 던진다. 「네가 끌어. 3년 동안 내 머리에 꽃 꽂아 주던 손이잖아.」 왕자가 마부 취급을 당하자 웃음이 터진다. 얼굴이 새빨개진 제나는 손끝에 불의 정령을 불러내 마른 짚더미에 내던진다.</w:t>
       </w:r>
     </w:p>
     <w:p>
@@ -4820,7 +4820,7 @@
           <w:b w:val="0"/>
           <w:sz w:val="21"/>
         </w:rPr>
-        <w:t>사흘 뒤 제나의 생일 연회. 뺨에 칼자국이 남은 채 다리를 절며 들어선 올리비아를, 하객들은 마구간에 불을 지른 범인이라며 손가락질한다. 데미안은 그 앞에서 꺼지지 않는 정령 보석을 제나 목에 걸어 주고, 하객들은 진짜 구원자에게 어울리는 선물이라며 손뼉을 친다. 그때 제나가 작은 유리병을 꺼내 흔든다. 올리비아의 혼례 짐에서 몰래 빼낸, 돌아가신 어머니가 마지막 숨으로 채워 남긴 정령수다. 올리비아가 돌려 달라며 다가서자 데미안이 앞을 막는다. 제나에게 사과하고, 불붙은 유리 등불을 맨손으로 감싸 쥔 채 불이 다 꺼질 때까지 버티면 돌려주겠다는 것이다. 제나가 웃으며 등불을 내민다. 「언니, 오늘도 내 등불 들고 서 있어 봐.」</w:t>
+        <w:t>사흘 뒤 제나의 생일 연회. 뺨에 칼자국이 남은 채 다리를 절며 들어선 올리비아를, 하객들은 마구간에 불을 지른 범인이라며 손가락질한다. 데미안은 그 앞에서 꺼지지 않는 정령 보석을 제나 목에 걸어 주고, 하객들은 진짜 구원자에게 어울리는 선물이라며 손뼉을 친다. 그때 제나가 작은 유리병을 꺼내 흔든다. 올리비아의 혼례 짐에서 몰래 빼낸, 돌아가신 어머니가 마지막 숨으로 채워 남긴 정령수다. 올리비아가 돌려 달라며 다가서자 데미안이 앞을 막는다. 제나에게 사과하고, 불의 정령이 갇힌 수정 구슬을 맨손으로 감싸 쥔 채 불이 다 꺼질 때까지 버티면 돌려주겠다는 것이다. 제나가 웃으며 이글거리는 구슬을 내민다. 「언니, 이거 들고 끝까지 서 있어 봐.」</w:t>
       </w:r>
     </w:p>
     <w:p>
@@ -4849,7 +4849,7 @@
           <w:b w:val="0"/>
           <w:sz w:val="21"/>
         </w:rPr>
-        <w:t>올리비아는 등불을 받아 들고 데미안을 똑바로 본다. 「들게. 대신 불은 네가 붙여.」 데미안이 불을 붙이자 유리가 달아오르고, 올리비아의 손바닥이 타들어 간다. 그런데 이를 악물고 비틀거리는 건 데미안이다. 찢어도 다 지워지지 않은 덩굴 때문에, 올리비아의 고통이 장갑 속 그의 손바닥으로 그대로 건너온 것이다. 데미안은 주먹을 쥐고 버티고, 올리비아는 눈 하나 깜빡하지 않는다. 마침내 불이 꺼지자 올리비아는 새까맣게 탄 손으로 등불을 내려놓는다. 「다 탔어. 사과는 불 지른 사람이 해.」 그리고 어머니의 병으로 손을 뻗는 순간, 제나가 한발 먼저 병을 낚아챈다.</w:t>
+        <w:t>올리비아는 구슬을 받아 들고 데미안을 똑바로 본다. 「들게. 대신 불은 네 손으로 깨워.」 데미안이 정령을 깨우자 구슬이 시뻘겋게 달아오르고, 올리비아의 손바닥이 타들어 간다. 그런데 이를 악물고 비틀거리는 건 데미안이다. 찢어도 다 지워지지 않은 덩굴 때문에, 올리비아의 고통이 장갑 속 그의 손바닥으로 그대로 건너온 것이다. 데미안은 주먹을 쥐고 버티고, 올리비아는 눈 하나 깜빡하지 않는다. 마침내 불이 꺼지자 올리비아는 새까맣게 탄 손으로 구슬을 내려놓는다. 「다 탔어. 사과는 불 지른 사람이 해.」 그리고 어머니의 병으로 손을 뻗는 순간, 제나가 한발 먼저 병을 낚아챈다.</w:t>
       </w:r>
     </w:p>
     <w:p>

</xml_diff>

<commit_message>
Auto commit (2026-10-07 09:56) — 15 changes
Claude Code 세션 종료 시 자동 커밋.

Co-Authored-By: Claude <noreply@anthropic.com>
Claude-Session: https://claude.ai/code/b8b53fcb-f8d6-4d92-a3e9-a236c8db2489
</commit_message>
<xml_diff>
--- a/projects/리메이크 러프 기획안 11종_v3.docx
+++ b/projects/리메이크 러프 기획안 11종_v3.docx
@@ -67,7 +67,7 @@
           <w:b/>
           <w:sz w:val="21"/>
         </w:rPr>
-        <w:t>Too Late, My Dragon Brothers</w:t>
+        <w:t>The Slave Who Was Their Dragon Princess</w:t>
       </w:r>
     </w:p>
     <w:p>
@@ -181,7 +181,7 @@
           <w:color w:val="6B6B6B"/>
           <w:sz w:val="21"/>
         </w:rPr>
-        <w:t xml:space="preserve">05  세트 A · 엘프  </w:t>
+        <w:t xml:space="preserve">05  세트 A · 엘프 · 빙의  </w:t>
       </w:r>
       <w:r>
         <w:rPr>
@@ -204,7 +204,7 @@
           <w:color w:val="6B6B6B"/>
           <w:sz w:val="21"/>
         </w:rPr>
-        <w:t xml:space="preserve">06  세트 B · 크리스마스 판타지  </w:t>
+        <w:t xml:space="preserve">06  세트 B · 얼음 용 왕국  </w:t>
       </w:r>
       <w:r>
         <w:rPr>
@@ -265,7 +265,7 @@
           <w:color w:val="6B6B6B"/>
           <w:sz w:val="21"/>
         </w:rPr>
-        <w:t xml:space="preserve">08  세트 B · 오빠들 · 늑대인간 왕궁 팩  </w:t>
+        <w:t xml:space="preserve">08  세트 B · 늑대인간 · 빨간 망토  </w:t>
       </w:r>
       <w:r>
         <w:rPr>
@@ -273,7 +273,7 @@
           <w:b/>
           <w:sz w:val="21"/>
         </w:rPr>
-        <w:t>Too Late, Alpha. I Rejected You First.</w:t>
+        <w:t>The Wolfless Mate He Left to Drown</w:t>
       </w:r>
     </w:p>
     <w:p>
@@ -326,7 +326,7 @@
           <w:color w:val="6B6B6B"/>
           <w:sz w:val="21"/>
         </w:rPr>
-        <w:t xml:space="preserve">10  세트 B · 오빠들  </w:t>
+        <w:t xml:space="preserve">10  세트 B · 오빠들 · 왕가의 병  </w:t>
       </w:r>
       <w:r>
         <w:rPr>
@@ -408,7 +408,7 @@
           <w:color w:val="1F3A5F"/>
           <w:sz w:val="34"/>
         </w:rPr>
-        <w:t>[T1] Too Late, My Dragon Brothers</w:t>
+        <w:t>[T1] The Slave Who Was Their Dragon Princess</w:t>
       </w:r>
     </w:p>
     <w:p>
@@ -645,7 +645,7 @@
           <w:b w:val="0"/>
           <w:sz w:val="21"/>
         </w:rPr>
-        <w:t>2. 오빠 셋의 뒤늦은 후회와 가짜의 약혼자까지 진짜에게 넘어오는 신분 역전 로맨스</w:t>
+        <w:t>2. 가짜 손목에선 스무 해 동안 식어 있던 죽은 왕비의 팔찌가 진짜 딸의 피에만 불을 켜는 핏줄 장치</w:t>
       </w:r>
     </w:p>
     <w:p>
@@ -660,7 +660,22 @@
           <w:b w:val="0"/>
           <w:sz w:val="21"/>
         </w:rPr>
-        <w:t>3. 남성향 노예 왕자 ㅡ&gt; 여성향 진짜 공주와 용족 오빠 셋 치환</w:t>
+        <w:t>3. 오빠 셋의 뒤늦은 후회와 가짜의 약혼자까지 진짜에게 넘어오는 신분 역전 로맨스</w:t>
+      </w:r>
+    </w:p>
+    <w:p>
+      <w:pPr>
+        <w:keepNext w:val="0"/>
+        <w:spacing w:after="40" w:before="0" w:line="336" w:lineRule="auto"/>
+        <w:ind w:left="170"/>
+      </w:pPr>
+      <w:r>
+        <w:rPr>
+          <w:rFonts w:ascii="맑은 고딕" w:hAnsi="맑은 고딕" w:eastAsia="맑은 고딕" w:cs="맑은 고딕"/>
+          <w:b w:val="0"/>
+          <w:sz w:val="21"/>
+        </w:rPr>
+        <w:t>4. 남성향 노예 왕자 ㅡ&gt; 여성향 진짜 공주와 용족 오빠 셋 치환</w:t>
       </w:r>
     </w:p>
     <w:p>
@@ -719,7 +734,7 @@
           <w:b w:val="0"/>
           <w:sz w:val="21"/>
         </w:rPr>
-        <w:t>왕가의 아기는 울 때 불씨가 튀는데, 거스가 왕궁에 안고 간 바네사의 울음엔 불씨가 없다. 시종들은 반역자들의 불에 공주의 불씨가 꺼졌다고 아뢰고, 용왕은 이 아이를 비웃는 혀는 직접 태우겠다고 맹세한다. 어린 세 왕자, 왕세자 알렉산더와 둘째 세바스찬, 셋째 도미닉도 자기 비늘을 뽑아 요람에 넣으며 막내를 평생 지키겠다고 맹세한다.</w:t>
+        <w:t>왕가의 아기는 울 때 불씨가 튀는데, 거스가 왕궁에 안고 간 바네사의 울음엔 불씨가 없다. 시종들은 반역자들의 불에 공주의 불씨가 꺼졌다고 아뢰고, 용왕은 이 아이를 비웃는 혀는 직접 태우겠다고 맹세한다. 어린 세 왕자, 왕세자 에드워드와 둘째 세바스찬, 셋째 도미닉도 자기 비늘을 뽑아 요람에 넣으며 막내를 평생 지키겠다고 맹세한다.</w:t>
       </w:r>
     </w:p>
     <w:p>
@@ -862,7 +877,7 @@
           <w:b w:val="0"/>
           <w:sz w:val="21"/>
         </w:rPr>
-        <w:t>바네사는 팔찌 찬 손목을 아이비의 입 앞에 내밀며, 엄마 팔찌에 입 맞추고 용서를 빌면 사육장으로 돌려보내 주겠다고 웃는다. 웨슬리가 앞으로 나서자 왕세자 알렉산더가 칼집으로 웨슬리의 가슴을 막는다. 아이비는 피 섞인 침을 팔찌 위에 뱉는다. 「용 똥은 스무 해 치웠어도, 네 손목엔 입 안 대.」 그 순간 아이비의 피가 묻은 팔찌가 하얗게 불을 켜고, 바네사의 손목을 내려다본 용왕과 알렉산더가 그대로 굳는다.</w:t>
+        <w:t>바네사는 팔찌 찬 손목을 아이비의 입 앞에 내밀며, 엄마 팔찌에 입 맞추고 용서를 빌면 사육장으로 돌려보내 주겠다고 웃는다. 웨슬리가 앞으로 나서자 왕세자 에드워드가 칼집으로 웨슬리의 가슴을 막는다. 아이비는 피 섞인 침을 팔찌 위에 뱉는다. 「용 똥은 스무 해 치웠어도, 네 손목엔 입 안 대.」 그 순간 아이비의 피가 묻은 팔찌가 하얗게 불을 켜고, 바네사의 손목을 내려다본 용왕과 에드워드가 그대로 굳는다.</w:t>
       </w:r>
     </w:p>
     <w:p>
@@ -1975,7 +1990,7 @@
           <w:b w:val="0"/>
           <w:sz w:val="21"/>
         </w:rPr>
-        <w:t>2년 동안 남친 타일러 쇼 한 사람만 찍느라 프로 구단의 사진 인턴 제안까지 거절한 스무 살 사진 전공생 몰리 터너. 크리스마스이브 밤에 우승컵 주인이 정해지는 3연전 홀리데이 시리즈 첫날, 몰리는 3주 동안 뜬 커플 루돌프 스웨터 한 벌은 입고 한 벌은 선물 상자에 담아 관중석에 선다. 노스필드 베어스 주장 타일러의 상대는 리지웨이 램스의 주장이자 크리스마스 파티마다 다른 여자를 데려오는 체이스 워커다. 체이스는 몰리의 렌즈 앞 유리에 입김을 불어 자기 등번호 17을 써 놓고, 질색하는 몰리를 보며 속으로 중얼거린다. 「올해 크리스마스 소원은 저 루돌프 스웨터 입은 여자다.」 몰리는 체이스가 오래전부터 자기를 좋아해 왔다는 걸 모른다. 관중석만 보던 체이스의 스케이트에 퍽이 맞고 램스 골문으로 들어가, 베어스가 자책골 하나로 첫 경기를 가져간다. 선물 상자를 안고 라커룸 문을 연 몰리는, 룸메이트 브리트니가 타일러의 9번 유니폼 하나만 걸친 채 타일러 무릎 위에 올라앉아 있는 걸 본다. 몰리는 소리 지르는 대신 카메라를 들어 셔터를 누른다.</w:t>
+        <w:t>2년 동안 남친 타일러 쇼 한 사람만 찍느라 프로 구단의 사진 인턴 제안까지 거절한 스무 살 사진 전공생 몰리 터너. 크리스마스이브 밤에 우승컵 주인이 정해지는 3연전 홀리데이 시리즈 첫날, 몰리는 3주 동안 뜬 커플 루돌프 스웨터 한 벌은 입고 한 벌은 선물 상자에 담아 관중석에 선다. 노스필드 베어스 주장 타일러의 상대는 리지웨이 램스의 주장이자 크리스마스 파티마다 다른 여자를 데려오는 체이스 워커다. 체이스는 몰리가 카메라를 댄 링크 유리벽에 입김을 불어 자기 등번호 17을 써 놓고, 질색하는 몰리를 보며 속으로 중얼거린다. 「올해 크리스마스 소원은 저 루돌프 스웨터 입은 여자다.」 몰리는 체이스가 오래전부터 자기를 좋아해 왔다는 걸 모른다. 관중석만 보던 체이스의 스케이트에 퍽이 맞고 램스 골문으로 들어가, 베어스가 자책골 하나로 첫 경기를 가져간다. 선물 상자를 안고 라커룸 문을 연 몰리는, 룸메이트 브리트니가 타일러의 9번 유니폼 하나만 걸친 채 타일러 무릎 위에 올라앉아 있는 걸 본다. 몰리는 소리 지르는 대신 카메라를 들어 셔터를 누른다.</w:t>
       </w:r>
     </w:p>
     <w:p>
@@ -2047,7 +2062,7 @@
           <w:b w:val="0"/>
           <w:sz w:val="21"/>
         </w:rPr>
-        <w:t>몰리가 눈을 뜬 곳은 체이스의 아파트 소파다. 이마에는 언 완두콩 봉지가 얹혀 있고, 몸에는 램스 담요가 덮여 있다. 체이스는 몰리가 잠꼬대로 자기 이름은 두 번 부르고 타일러 이름은 한 번도 안 불렀다고 놀린다. 몰리는 거짓말 말라며, 작년 홀리데이 시리즈 때 체이스가 일부러 자기 렌즈 앞 유리에 퍽을 꽂아 렌즈를 깨 먹은 걸 아직 안 잊었다고 쏘아붙인다. 체이스는 그때도 몰리 렌즈가 타일러만 따라다녀서 그랬다고 웃지만, 몰리는 그 말을 농담으로만 듣는다.</w:t>
+        <w:t>몰리가 눈을 뜬 곳은 체이스의 아파트 소파다. 이마에는 언 완두콩 봉지가 얹혀 있고, 몸에는 램스 담요가 덮여 있다. 체이스는 몰리가 잠꼬대로 자기 이름은 두 번 부르고 타일러 이름은 한 번도 안 불렀다고 놀린다. 몰리는 거짓말 말라며, 작년 홀리데이 시리즈 때 체이스가 관중석으로 날린 퍽에 자기 렌즈가 깨진 걸 아직 안 잊었다고 쏘아붙인다. 체이스는 그때도 몰리 렌즈가 타일러만 따라다녀서 그랬다고 웃지만, 몰리는 그 말을 농담으로만 듣는다.</w:t>
       </w:r>
     </w:p>
     <w:p>
@@ -2061,7 +2076,7 @@
           <w:b w:val="0"/>
           <w:sz w:val="21"/>
         </w:rPr>
-        <w:t>완두콩 봉지를 내려놓은 몰리는, 타일러 말대로 자기가 정말 뜯어 볼 것도 없는 여자면 어떡하냐고 묻는다. 체이스는 대답 대신 타일러에게 똑같이 망신을 돌려주자고 한다. 체이스도 크리스마스이브 결승 날 타일러가 퍽 대신 몰리 생각만 하게 만들고 싶다. 어쩌자는 거냐는 몰리 앞에서 체이스가 휴대폰 카메라를 켠다. 「타일러한테 사진 한 장 보내자. 새벽 세 시, 내 침대 위의 너로.」</w:t>
+        <w:t>완두콩 봉지를 내려놓은 몰리는, 타일러 말대로 자기가 정말 뜯어 볼 것도 없는 여자면 어떡하냐고 묻는다. 체이스는 대답 대신 타일러에게 똑같이 망신을 돌려주자고 한다. 체이스도 크리스마스이브 결승 날 타일러가 퍽 대신 몰리 생각만 하게 만들고 싶다. 어쩌자는 거냐는 몰리에게 체이스가 몸을 기울인다. 「나랑 자자. 크리스마스이브까지.」</w:t>
       </w:r>
     </w:p>
     <w:p>
@@ -2090,7 +2105,7 @@
           <w:b w:val="0"/>
           <w:sz w:val="21"/>
         </w:rPr>
-        <w:t>몰리가 미쳤냐며 담요를 던지자, 체이스는 손끝 하나 안 대고 사진만 찍자는 거라고, 타일러가 둘이 잤다고 믿기만 하면 된다고 한다. 베어스를 배신할 순 없다는 몰리에게 체이스가 브리트니의 SNS 게시물을 내민다. 브리트니가 몰리의 진저브레드 상자를 안고 자기가 구웠다고 올린 사진에는, 12월 무패가 다 브리트니 덕이라는 타일러의 댓글이 달려 있다. 등번호를 아이싱으로 써 넣은 그 쿠키는 몰리가 경기 날마다 새벽에 구워 온 것이다. 몰리는 말없이 체이스를 침대에 눕히고 조명부터 맞춘 뒤 카메라 타이머를 누른다. 새벽 세 시, 헝클어진 시트와 체이스의 맨어깨, 그 위에 얹힌 몰리 손만 걸린 사진 한 장이 타일러에게 간다.</w:t>
+        <w:t>몰리가 미쳤냐며 담요를 던지자, 체이스는 손끝 하나 안 대고 잔 척만 하자는 거라고, 새벽 세 시에 자기 침대에서 찍은 사진 한 장으로 타일러가 둘이 잤다고 믿기만 하면 된다고 한다. 베어스를 배신할 순 없다는 몰리에게 체이스가 브리트니의 SNS 게시물을 내민다. 브리트니가 몰리의 진저브레드 상자를 안고 자기가 구웠다고 올린 사진에는, 12월 무패가 다 브리트니 덕이라는 타일러의 댓글이 달려 있다. 등번호를 아이싱으로 써 넣은 그 쿠키는 몰리가 경기 날마다 새벽에 구워 온 것이다. 몰리는 말없이 체이스를 침대에 눕히고 조명부터 맞춘 뒤 카메라 타이머를 누른다. 새벽 세 시, 헝클어진 시트와 체이스의 맨어깨, 그 위에 얹힌 몰리 손만 걸린 사진 한 장이 타일러에게 간다.</w:t>
       </w:r>
     </w:p>
     <w:p>
@@ -3090,7 +3105,7 @@
           <w:color w:val="6B6B6B"/>
           <w:sz w:val="18"/>
         </w:rPr>
-        <w:t>05 · 원작 NetShort &lt;I Spoke Baby Dragon and Won Everyone Over!&gt; · 세트 A (엘프)</w:t>
+        <w:t>05 · 원작 NetShort &lt;I Spoke Baby Dragon and Won Everyone Over!&gt; · 세트 A (엘프 · 빙의)</w:t>
       </w:r>
     </w:p>
     <w:p>
@@ -3704,7 +3719,7 @@
           <w:color w:val="6B6B6B"/>
           <w:sz w:val="18"/>
         </w:rPr>
-        <w:t>06 · 원작 NetShort &lt;I Spoke Baby Dragon and Won Everyone Over!&gt; · 세트 B (크리스마스 판타지)</w:t>
+        <w:t>06 · 원작 NetShort &lt;I Spoke Baby Dragon and Won Everyone Over!&gt; · 세트 B (얼음 용 왕국)</w:t>
       </w:r>
     </w:p>
     <w:p>
@@ -3881,7 +3896,7 @@
           <w:b w:val="0"/>
           <w:sz w:val="21"/>
         </w:rPr>
-        <w:t xml:space="preserve">  #Nanny, Dragon, Christmas, Cute Baby</w:t>
+        <w:t xml:space="preserve">  #Nanny, Dragon, Cute Baby, Royalty</w:t>
       </w:r>
     </w:p>
     <w:p>
@@ -4175,7 +4190,7 @@
           <w:b w:val="0"/>
           <w:sz w:val="21"/>
         </w:rPr>
-        <w:t>그 시각 할머니 대비 루스는, 인간을 연회에서 빼 달라는 마거릿에게 연회 내내 올리가 안 울면 유모장 열쇠를 그 인간에게 넘기겠다고 한다. 누운 채 헨리가 내일 연회에선 해를 부르는 얼음 북을 백 번 친다고 하자, 북이라는 말에 잠든 올리가 움찔한다. 헨리가 그제야 입을 연다. 「폭풍 치던 그 밤에도, 밤새 북을 쳤어.」</w:t>
+        <w:t>그 시각 할머니 대비 루스는, 인간을 연회에서 빼 달라는 마거릿에게 연회 내내 올리가 안 울면 유모장 열쇠를 그 인간에게 넘기겠다고 한다. 누운 채 헨리가 내일 연회에선 해를 부르는 얼음 북을 백 번 친다고 하자, 북이라는 말에 잠든 올리가 움찔한다. 헨리가 그제야 입을 연다. 「폭풍 치던 그 밤에도, 부모님 돌아오라고 밤새 북을 쳤어.」</w:t>
       </w:r>
     </w:p>
     <w:p>
@@ -4511,7 +4526,7 @@
           <w:b w:val="0"/>
           <w:sz w:val="21"/>
         </w:rPr>
-        <w:t>계모 손에 백금발을 검게 물들여 '재앙의 흑발'로 멸시받는 엘프 공작가 맏딸이, 백금발로 염색한 이복동생을 어린 날 자기 목숨을 구한 소녀로 믿는 영혼의 반려를 먼저 버리고, 동생이 죽어도 싫다던 다크 엘프 왕과의 혼인을 스스로 거래해, 끝내 백금발을 되찾고 그 왕의 왕비가 되는 이야기.</w:t>
+        <w:t>계모 손에 백금발을 검게 물들여 '재앙의 흑발'로 멸시받는 엘프 공작가 맏딸이, 백금발로 염색한 이복동생을 어린 날 그의 목숨을 구한 소녀로 믿는 영혼의 반려를 먼저 버리고, 동생이 죽어도 싫다던 다크 엘프 왕과의 혼인을 스스로 거래해, 끝내 백금발을 되찾고 그 왕의 왕비가 되는 이야기.</w:t>
       </w:r>
     </w:p>
     <w:p>
@@ -4587,7 +4602,7 @@
           <w:b w:val="0"/>
           <w:sz w:val="21"/>
         </w:rPr>
-        <w:t>4. 웨어울프 ㅡ&gt; 엘프 치환 (백금발 = 순혈의 상징, 흑발 = 적국 다크 엘프의 색)</w:t>
+        <w:t>4. 웨어울프 ㅡ&gt; 엘프 치환 (백금발 = 순혈 엘프의 상징, 흑발 = 다크 엘프의 색이라 재앙으로 멸시)</w:t>
       </w:r>
     </w:p>
     <w:p>
@@ -4632,7 +4647,7 @@
           <w:b w:val="0"/>
           <w:sz w:val="21"/>
         </w:rPr>
-        <w:t>공작 저택 절벽 테라스. 둘째 딸 제나가 난간 위에서, 눈이 멀었다는 다크 엘프 왕에게 시집가느니 뛰어내리겠다고 울부짖는다. 계모 다이앤은 딸을 붙들고 남편 공작을 몰아세운다. 이 집에 딸이 제나 하나뿐이냐고. 그때 맏딸 올리비아가 덩굴을 타고 공중에서 내려선다. 타고난 백금발을 계모 손에 검게 물들인 채 '재앙의 흑발'이라 손가락질받으며 자란 딸이다. 「죽고 싶어? 그럼 죽어.」 올리비아의 덩굴이 제나를 휘감아 절벽 아래로 내던진다. 공작이 다급히 정령 바람을 날려, 바위에 부딪히기 직전의 제나를 겨우 끌어 올린다. 올리비아가 아버지를 돌아본다. 「쟤가 죽어도 싫다는 그 혼인, 내가 갈게요. 값은 제대로 치르세요.」</w:t>
+        <w:t>공작 저택 절벽 테라스. 둘째 딸 제나가 난간 위에서, 눈이 멀었다는 다크 엘프 왕에게 시집가느니 뛰어내리겠다고 울부짖는다. 계모 다이앤은 딸을 붙들고 남편 공작을 몰아세운다. 이 집에 딸이 제나 하나뿐이냐고. 그때 맏딸 올리비아가 덩굴을 타고 공중에서 내려선다. 타고난 백금발을 계모 손에 검게 물들인 채 '재앙의 흑발'이라 손가락질받으며 자란 딸이다. 「죽고 싶어? 그럼 죽어.」 올리비아의 덩굴이 제나를 휘감아 절벽 아래로 내던진다. 공작이 다급히 정령 바람을 날려, 바위에 부딪히기 직전의 제나를 겨우 끌어 올린다. 어떻게 동생한테 이럴 수 있냐는 다이앤의 비명에 올리비아가 받아친다. 「엄마 살아 있을 때부터 아버지 첩이던 여자 딸이, 무슨 내 동생이야.」 그리고 아버지를 돌아본다. 「쟤가 죽어도 싫다는 그 혼인, 내가 갈게요. 대신 계모가 숨겨 둔 엄마 유품부터 내놓으세요.」</w:t>
       </w:r>
     </w:p>
     <w:p>
@@ -4820,7 +4835,7 @@
           <w:b w:val="0"/>
           <w:sz w:val="21"/>
         </w:rPr>
-        <w:t>사흘 뒤 제나의 생일 연회. 뺨에 칼자국이 남은 채 다리를 절며 들어선 올리비아를, 하객들은 마구간에 불을 지른 범인이라며 손가락질한다. 데미안은 그 앞에서 꺼지지 않는 정령 보석을 제나 목에 걸어 주고, 하객들은 진짜 구원자에게 어울리는 선물이라며 손뼉을 친다. 그때 제나가 작은 유리병을 꺼내 흔든다. 올리비아의 혼례 짐에서 몰래 빼낸, 돌아가신 어머니가 마지막 숨으로 채워 남긴 정령수다. 올리비아가 돌려 달라며 다가서자 데미안이 앞을 막는다. 제나에게 사과하고, 불의 정령이 갇힌 수정 구슬을 맨손으로 감싸 쥔 채 불이 다 꺼질 때까지 버티면 돌려주겠다는 것이다. 제나가 웃으며 이글거리는 구슬을 내민다. 「언니, 이거 들고 끝까지 서 있어 봐.」</w:t>
+        <w:t>사흘 뒤 제나의 생일 연회. 뺨에 칼자국이 남은 채 다리를 절며 들어선 올리비아를, 하객들은 마구간에 불을 지른 범인이라며 손가락질한다. 데미안은 그 앞에서 꺼지지 않는 정령 보석을 제나 목에 걸어 주고, 하객들은 진짜 구원자에게 어울리는 선물이라며 손뼉을 친다. 그때 제나가 작은 유리병을 꺼내 흔든다. 올리비아가 혼인 값으로 겨우 돌려받아 혼례 짐에 넣어 둔, 어머니가 마지막 숨으로 채워 남긴 정령수다. 올리비아가 돌려 달라며 다가서자 데미안이 앞을 막는다. 제나에게 사과하고, 불의 정령이 갇힌 수정 구슬을 맨손으로 감싸 쥔 채 불이 다 꺼질 때까지 버티면 돌려주겠다는 것이다. 제나가 웃으며 이글거리는 구슬을 내민다. 「언니, 이거 들고 끝까지 서 있어 봐.」</w:t>
       </w:r>
     </w:p>
     <w:p>
@@ -4921,7 +4936,7 @@
           <w:color w:val="6B6B6B"/>
           <w:sz w:val="18"/>
         </w:rPr>
-        <w:t>08 · 원작 DramaWave &lt;The Silver Angel He Never Recognized&gt; · 세트 B (오빠들 · 늑대인간 왕궁 팩)</w:t>
+        <w:t>08 · 원작 DramaWave &lt;The Silver Angel He Never Recognized&gt; · 세트 B (늑대인간 · 빨간 망토)</w:t>
       </w:r>
     </w:p>
     <w:p>
@@ -4937,7 +4952,7 @@
           <w:color w:val="1F3A5F"/>
           <w:sz w:val="34"/>
         </w:rPr>
-        <w:t>[T1] Too Late, Alpha. I Rejected You First.</w:t>
+        <w:t>[T1] The Wolfless Mate He Left to Drown</w:t>
       </w:r>
     </w:p>
     <w:p>
@@ -5128,7 +5143,7 @@
           <w:b w:val="0"/>
           <w:sz w:val="21"/>
         </w:rPr>
-        <w:t>늑대가 깨어나지 않아 알파인 아버지에게도 팩의 수치로 불리는 첫째 공주가, 이복동생의 이름을 부른 메이트를 먼저 거부하고, 아버지가 이복동생 대신 보내려는 늑대 잃은 알파와의 정략결혼을 스스로 택해 집을 버리고 떠나, 끝내 백 년 만의 붉은 늑대로 깨어나 그 알파의 루나가 되는 이야기.</w:t>
+        <w:t>늑대가 깨어나지 않아 알파인 아버지에게도 팩의 수치로 불리는 첫째 공주가, 이복동생의 이름을 부른 메이트를 먼저 거부하고, 죽겠다고 떼쓰는 그 동생 대신 늑대를 잃었다는 알파와의 정략결혼을 스스로 택해 집을 버리고, 끝내 백 년 만의 붉은 늑대로 깨어나 그 알파의 루나가 되는 이야기.</w:t>
       </w:r>
     </w:p>
     <w:p>
@@ -5159,7 +5174,7 @@
           <w:b w:val="0"/>
           <w:sz w:val="21"/>
         </w:rPr>
-        <w:t>1. 짓밟혀도 매달리지 않고 먼저 버리는 걸크러시 여주, 양산형 전개를 깨는 반응</w:t>
+        <w:t>1. 죽겠다며 떼쓰는 동생을 진짜로 밀어 버리고, 알파의 명령에도 꿇지 않는 걸크러시 여주</w:t>
       </w:r>
     </w:p>
     <w:p>
@@ -5174,7 +5189,7 @@
           <w:b w:val="0"/>
           <w:sz w:val="21"/>
         </w:rPr>
-        <w:t>2. 늑대를 구한 빨간 망토 소녀를 엉뚱한 여자로 믿고 짓밟는 메이트, 후회물의 정석</w:t>
+        <w:t>2. 어린 날 자기를 구한 빨간 망토 소녀를 엉뚱한 여자로 믿고 진짜 메이트를 얼음물에 두고 간 남자, 후회물의 정석</w:t>
       </w:r>
     </w:p>
     <w:p>
@@ -5189,7 +5204,7 @@
           <w:b w:val="0"/>
           <w:sz w:val="21"/>
         </w:rPr>
-        <w:t>3. 늑대 없는 공주와 늑대 잃었다는 알파의 정략결혼, 둘 다 소문과 다른 히든 아이덴티티</w:t>
+        <w:t>3. 늑대 없는 공주와 늑대를 잃었다는 알파의 정략결혼, 둘 다 소문과 다른 히든 아이덴티티</w:t>
       </w:r>
     </w:p>
     <w:p>
@@ -5249,7 +5264,7 @@
           <w:b w:val="0"/>
           <w:sz w:val="21"/>
         </w:rPr>
-        <w:t>늑대가 깨어나지 않아 알파인 아버지에게도 스톤리지 왕궁 팩의 수치로 불리는 첫째 공주 그레이스 콜린스. 그레이스가 자기를 지킬 호위를 고르는 날, 후보 늑대들은 관례대로 무릎을 꿇고 목을 내민다. 새엄마 린다의 딸 앰버가 늑대도 없는 주인에게 목을 내미는 꼴이 우습다며 웃는 사이, 혼자 꿇지 않고 선 남자가 있다. 신분을 숨긴 하이랜드 팩의 알파 로건이다. 로건은 어린 날 사냥꾼 덫에서 자기를 풀어 준 빨간 망토의 소녀를 찾아 숨어들었고, 어릴 적 빨간 망토를 두르고 다닌 앰버가 그 소녀라고 믿는다.</w:t>
+        <w:t>늑대가 깨어나지 않아 알파인 아버지에게도 스톤리지 팩의 수치로 불리는 첫째 공주 그레이스 콜린스. 그레이스가 자기를 지킬 호위를 고르는 날, 후보 늑대들은 관례대로 무릎을 꿇고 목을 내민다. 새엄마 린다의 딸 앰버가 늑대도 없는 주인에게 목을 내미는 꼴이 우습다며 웃는 사이, 혼자 꿇지 않고 선 남자가 있다. 신분을 숨긴 하이랜드 팩의 알파 로건이다. 로건은 어린 날 사냥꾼 덫에서 자기를 풀어 준 빨간 망토의 소녀를 찾아 숨어들었고, 어릴 적 빨간 망토를 두르고 다닌 앰버가 그 소녀라고 믿는다.</w:t>
       </w:r>
     </w:p>
     <w:p>
@@ -5292,7 +5307,7 @@
           <w:b w:val="0"/>
           <w:sz w:val="21"/>
         </w:rPr>
-        <w:t>그날부터 2년 동안 로건은 밤마다 그레이스의 방문 앞에서 잠든다. 로건이 하이랜드의 알파라는 게 드러나도, 그레이스는 신분을 숨긴 것까지 자기를 지키려던 마음이라 믿는다. 메이트 맹세식 날, 그레이스는 린다가 금지한 빨간 망토를 어린 날 이후 처음 두른다. 알파인 아버지 토머스 앞에서 두 사람 손목을 맹세의 끈으로 묶던 로건이, 그 망토를 내려다보며 앰버의 이름을 부른다. 그레이스는 그날 빼앗은 로건의 단검으로 끈을 끊는다. 「거부는 내가 먼저 해. 앰버한테 가.」</w:t>
+        <w:t>그날부터 2년 동안 로건은 밤마다 그레이스의 방문 앞에서 잠들고, 아침마다 그레이스의 드레스 끈을 묶어 준다. 로건이 하이랜드 팩의 알파라는 게 드러났을 때도, 그레이스는 알파가 신분까지 숨기고 자기를 지켜 준 거라 믿으며 그를 사랑했다. 메이트 맹세식 날, 그레이스는 린다가 금지한 빨간 망토를 어린 날 이후 처음 두른다. 알파인 아버지 토머스 앞에서 두 사람 손목을 맹세의 끈으로 묶던 로건이, 그 망토를 내려다보다 앰버의 이름을 부른다. 그레이스는 그날 빼앗은 로건의 단검으로 끈을 끊는다. 「거부는 내가 먼저 해. 앰버한테 가.」</w:t>
       </w:r>
     </w:p>
     <w:p>
@@ -5306,7 +5321,7 @@
           <w:b w:val="0"/>
           <w:sz w:val="21"/>
         </w:rPr>
-        <w:t>한 달 뒤, 토머스가 맺은 혼약대로 전쟁에서 늑대를 잃었다는 섀도우밸리 팩의 후계자 네이선에게 시집가라는 말에 앰버가 숨이 넘어갈 듯 쓰러진다. 린다가 혼약서에는 스톤리지의 공주라고만 적혀 있다고 하자, 토머스는 늑대 없는 딸에겐 늑대 잃은 놈이 딱이라며 그레이스를 본다. 그레이스가 물 주전자를 앰버 얼굴에 붓자, 앰버가 비명을 지르며 벌떡 일어난다. 그레이스가 빈 주전자를 내려놓는다. 「그 결혼, 내가 해. 아빠가 날 보내는 게 아니야. 내가 이 집을 버리는 거야.」</w:t>
+        <w:t>한 달 뒤, 토머스가 오래전 맺은 혼약대로 전쟁에서 늑대를 잃었다는 섀도우밸리 팩의 알파 알렉산더에게 시집가라는 말에, 앰버가 성벽 망루 난간 위로 올라선다. 늑대도 없는 반쪽짜리 남자에게 가느니 뛰어내리겠다는 것이다. 린다는 딸을 붙들고 토머스를 몰아세운다. 혼약서엔 스톤리지의 공주라고만 적혀 있는데, 이 집에 공주가 앰버 하나뿐이냐고. 그때 망루 계단을 올라온 그레이스가 앰버 앞에 선다. 「죽고 싶어? 그럼 죽어.」 그레이스가 앰버를 난간 밖으로 밀어 버리고, 토머스가 늑대로 변해 뛰어올라 떨어지는 앰버의 옷깃을 물고 간신히 끌어 올린다. 어떻게 동생한테 이러냐는 린다의 비명에 그레이스가 받아친다. 「엄마 죽기도 전에 아빠 침대에 기어든 여자 딸이, 무슨 내 동생이야.」 그리고 사람으로 돌아온 아버지를 본다. 「그 결혼, 내가 해. 아빠가 날 보내는 게 아니야. 내가 이 집을 버리는 거야.」</w:t>
       </w:r>
     </w:p>
     <w:p>
@@ -5335,7 +5350,7 @@
           <w:b w:val="0"/>
           <w:sz w:val="21"/>
         </w:rPr>
-        <w:t>그 말을 전해 들은 그날 밤, 로건은 홧김에 한 소리라 여기고 앰버에게 줄 새 빨간 망토를 받아 든다. 베타가 앰버 님이 좋아하겠다고 하자, 로건은 어린 날 자기 다리를 묶느라 찢어진 망토를 이제야 새것으로 갚는다며 웃는다.</w:t>
+        <w:t>그 말을 전해 들은 밤, 로건은 홧김에 한 소리라 여기고 앰버에게 줄 새 빨간 망토를 받아 든다. 베타가 앰버 님이 좋아하겠다고 하자, 로건은 어린 날 자기 다리를 묶느라 찢어진 망토를 이제야 새것으로 갚는다며 웃는다.</w:t>
       </w:r>
     </w:p>
     <w:p>
@@ -5363,7 +5378,7 @@
           <w:b w:val="0"/>
           <w:sz w:val="21"/>
         </w:rPr>
-        <w:t>다음 날 그레이스는 혼례 짐을 사러 장터까지 호위하라고 하지만, 새 망토를 두른 앰버가 말 앞을 막아서자 로건은 앰버를 태우고 먼저 떠난다. 빨간 망토를 두른 그레이스가 눈길을 혼자 걸어 장터에 닿았을 때, 로건은 앰버의 망토 끈을 매 주고 있다. 그때 토머스가 보낸 전령이 장터 한가운데서 외친다. 「스톤리지의 첫째 공주 그레이스, 보름 뒤 섀도우밸리의 네이선과 혼인한다!」</w:t>
+        <w:t>다음 날 그레이스는 혼례 짐을 사러 장터까지 호위하라고 하지만, 새 망토를 두른 앰버가 말 앞을 막아서자 로건은 앰버를 태우고 먼저 떠난다. 빨간 망토를 두른 그레이스가 눈길을 혼자 걸어 장터에 닿았을 때, 로건은 2년 동안 그레이스에게 해 주던 그 손길로 앰버의 망토 끈을 매 주고 있다. 그때 토머스가 보낸 전령이 장터 한가운데서 외친다. 「스톤리지의 첫째 공주 그레이스, 보름 뒤 섀도우밸리의 알렉산더와 혼인한다!」</w:t>
       </w:r>
     </w:p>
     <w:p>
@@ -5392,7 +5407,7 @@
           <w:b w:val="0"/>
           <w:sz w:val="21"/>
         </w:rPr>
-        <w:t>늑대 없는 공주가 늑대 잃은 알파에게 팔려 간다며 장터가 웃음바다가 되자, 앰버는 그레이스의 빨간 망토를 가리키며 이 팩에 빨간 망토는 하나뿐이라고 울먹인다. 로건은 앰버 편에 서서 그레이스에게 망토를 내놓으라고 손을 내민다.</w:t>
+        <w:t>늑대 없는 공주가 늑대 잃은 알파에게 팔려 간다며 장터가 웃음바다가 되자, 앰버는 그레이스의 망토를 가리키며 언니는 아직도 자기가 입다 버린 걸 두르고 다닌다고 웃는다. 이 팩에 빨간 망토는 하나면 된다며 앰버가 로건의 팔에 매달리고, 로건은 그레이스에게 망토를 내놓으라고 손을 내민다.</w:t>
       </w:r>
     </w:p>
     <w:p>
@@ -5406,7 +5421,7 @@
           <w:b w:val="0"/>
           <w:sz w:val="21"/>
         </w:rPr>
-        <w:t>어린 시절, 앰버는 자기 손으로 자기 뺨을 할퀴고는 그레이스가 자기 빨간 망토를 찢고 때렸다고 울었다. 그 망토는 죽은 엄마가 그레이스에게 지어 준 것이었고 찢어진 단은 덫에 걸린 늑대 새끼를 묶어 주느라 뜯은 것이었지만, 토머스는 그레이스의 말은 듣지도 않고 앰버만 안아 주었다. 린다는 망토를 앰버에게 주고, 그레이스에게 다시는 빨간 것을 두르지 말라고 했다. 그 늑대 새끼가 로건이었다는 건 그레이스도 모른다.</w:t>
+        <w:t>그 망토는 죽은 엄마가 그레이스에게 지어 준 것이다. 어린 그레이스가 덫에 걸린 늑대 새끼의 다리를 묶느라 단을 뜯어 오자, 앰버는 자기 손으로 자기 뺨을 할퀴고는 언니가 망토를 찢고 자기를 때렸다고 울었다. 토머스는 그레이스 말은 듣지도 않고 앰버만 안아 주었고, 린다는 그 망토를 앰버에게 주며 그레이스에게 다시는 빨간 것을 두르지 말라고 했다. 몇 해 뒤 싫증이 난 앰버가 내다 버린 망토를, 그레이스는 몰래 주워 찢어진 단을 기워 두었다. 그 늑대 새끼가 로건이었다는 건 그레이스도 모른다.</w:t>
       </w:r>
     </w:p>
     <w:p>
@@ -5420,7 +5435,7 @@
           <w:b w:val="0"/>
           <w:sz w:val="21"/>
         </w:rPr>
-        <w:t>앰버가 장터 화로를 가리키며 로건의 팔에 매달린다. 「저 망토, 언니 손으로 저 불에 넣게 해 줘.」</w:t>
+        <w:t>앰버가 장터 화로를 가리키며 로건의 팔을 끌어당긴다. 「저 망토, 언니 손으로 저 불에 넣게 해 줘.」</w:t>
       </w:r>
     </w:p>
     <w:p>
@@ -5492,7 +5507,7 @@
           <w:b w:val="0"/>
           <w:sz w:val="21"/>
         </w:rPr>
-        <w:t>로건이 앰버를 끌어올리는 사이 그레이스의 손이 얼음 끝에서 미끄러지고, 로건은 떨고 있는 앰버를 안고 호숫가로 달린다. 어두운 물 밑으로 가라앉던 그레이스의 몸 안에서 한 번도 깨어난 적 없던 늑대가 눈을 뜬다. 얼음이 아래에서 터지고, 백 년 만에 나타난 붉은 늑대가 호수 위로 뛰어오른다. 앰버는 로건의 가슴에 얼굴을 묻고 울고 있어서, 그 늑대를 본 사람은 로건뿐이다. 사람 모습으로 돌아와 쓰러진 그레이스에게 로건이 다가가려 하자, 앰버가 언니가 자기를 물속으로 끌어당겼다고 흐느끼고, 로건은 걸음을 멈춘다.</w:t>
+        <w:t>로건이 앰버를 끌어올리는 사이 그레이스의 손이 얼음 끝에서 미끄러지고, 로건은 떨고 있는 앰버를 안고 호숫가로 달린다. 어두운 물 밑으로 가라앉던 그레이스의 몸 안에서 한 번도 깨어난 적 없던 늑대가 눈을 뜬다. 얼음이 아래에서 터지고, 백 년 만에 나타난 붉은 늑대가 호수 위로 뛰어오른다. 앰버는 로건의 가슴에 얼굴을 묻고 울고 있어서, 그 늑대를 본 사람은 로건뿐이다. 사람 모습으로 돌아와 눈밭에 쓰러진 그레이스에게 로건이 손을 내밀자, 그레이스가 그 손을 쳐 낸다. 「이미 골랐잖아. 이제 와서 걱정하는 척하지 마.」 그때 앰버가 언니가 자기를 물속으로 끌어당겼다고 흐느끼고, 로건은 결국 앰버에게 돌아선다.</w:t>
       </w:r>
     </w:p>
     <w:p>
@@ -5506,7 +5521,7 @@
           <w:b w:val="0"/>
           <w:sz w:val="21"/>
         </w:rPr>
-        <w:t>같은 시각 섀도우밸리 팩의 성, 전쟁에서 늑대를 잃었다는 네이선이 신부의 호위가 하이랜드 팩 알파 로건이라는 보고를 받는다. 목에 오래된 발톱 흉터가 난 네이선이 보고서를 구기자, 그 손끝에서 늑대 발톱이 솟는다. 「늑대 잃은 놈 노릇은 여기까지다. 내 신부는 내가 데려온다.」</w:t>
+        <w:t>같은 시각 섀도우밸리 팩의 성, 전쟁에서 늑대를 잃었다는 알렉산더가 신부의 호위가 하이랜드 팩 알파 로건이라는 보고를 받는다. 목에 오래된 발톱 흉터가 난 알렉산더가 보고서를 구기자, 그 손끝에서 늑대 발톱이 솟는다. 「늑대 잃은 놈 노릇은 여기까지다. 내 신부는 내가 데려온다.」</w:t>
       </w:r>
     </w:p>
     <w:p>
@@ -5535,7 +5550,7 @@
           <w:b w:val="0"/>
           <w:sz w:val="21"/>
         </w:rPr>
-        <w:t>네이선이 길을 나선 그 밤, 스톤리지 왕궁 대연회장에서는 앰버가 살아 돌아온 것을 축하하는 토머스의 연회가 열린다. 토머스는 하이랜드의 알파가 직접 구해 낸 앰버가 팩의 자랑이라며 잔을 들고, 물에서 겨우 살아난 그레이스가 들어서도 동생을 물에 빠뜨리려 한 딸이라며 눈길도 주지 않는다. 호수에서 붉은 늑대를 본 로건은 그 일을 누구에게도 말하지 않는다.</w:t>
+        <w:t>알렉산더가 길을 나선 그 밤, 스톤리지 성 대연회장에서는 앰버가 살아 돌아온 것을 축하하는 토머스의 연회가 열린다. 토머스는 하이랜드의 알파가 직접 구해 낸 앰버가 팩의 자랑이라며 잔을 들고, 물에서 겨우 살아난 그레이스가 들어서도 동생을 물에 빠뜨리려 한 딸이라며 눈길도 주지 않는다. 로건은 호수에서 본 붉은 늑대를, 앰버를 구하느라 헛것을 본 거라고 여긴다.</w:t>
       </w:r>
     </w:p>
     <w:p>
@@ -5635,7 +5650,7 @@
           <w:b w:val="0"/>
           <w:sz w:val="21"/>
         </w:rPr>
-        <w:t>그레이스가 앰버에게 달려들자, 로건이 메이트 표식이 남은 손으로 그레이스의 목을 움켜쥐고 앰버에게서 떼어 낸다. 목이 졸린 그레이스가 로건을 본다. 「그날 네 목에서 칼을 떼는 게 아니었어.」 그 순간 목에 오래된 발톱 흉터가 난 낯선 남자가 로건의 손목을 꺾어 떼어 내고 그레이스를 품에 안는다. 「내 신부 목을 잡은 손이야. 두고 가.」</w:t>
+        <w:t>그레이스가 앰버에게 달려들자, 로건이 메이트 표식이 남은 손으로 그레이스의 목을 움켜쥐고 앰버에게서 떼어 낸다. 목이 졸린 그레이스가 로건을 본다. 「그날 네 목에서 칼을 떼는 게 아니었어.」 그 순간 연회장 문이 부서지고, 목에 발톱 흉터가 난 남자가 로건의 손목을 꺾어 떼어 내며 쓰러지는 그레이스를 품에 안는다. 늑대를 잃었다던 섀도우밸리의 알파 알렉산더가 로건을 내려다본다. 「감히 내 루나를 건드려? 오늘 여기서 살아 나갈 생각 마라!」</w:t>
       </w:r>
     </w:p>
     <w:p>
@@ -5931,7 +5946,7 @@
           <w:b w:val="0"/>
           <w:sz w:val="21"/>
         </w:rPr>
-        <w:t>2. 비밀 아기·계약 가족 로맨스의 정석</w:t>
+        <w:t>2. 왕세자를 아빠라 부르고 국왕 목에 목도리를 감는 뻔뻔한 다섯 살 공범 아들, 비밀 아기·계약 가족 로맨스의 정석</w:t>
       </w:r>
     </w:p>
     <w:p>
@@ -6407,7 +6422,7 @@
           <w:color w:val="6B6B6B"/>
           <w:sz w:val="18"/>
         </w:rPr>
-        <w:t>10 · 원작 DramaWave &lt;Fated Reunion: My Daddy Is The Crown Prince&gt; · 세트 B (오빠들)</w:t>
+        <w:t>10 · 원작 DramaWave &lt;Fated Reunion: My Daddy Is The Crown Prince&gt; · 세트 B (오빠들 · 왕가의 병)</w:t>
       </w:r>
     </w:p>
     <w:p>
@@ -6645,7 +6660,7 @@
           <w:b w:val="0"/>
           <w:sz w:val="21"/>
         </w:rPr>
-        <w:t>1. 가짜 아빠를 연기하는 왕세자, 그 아이가 하룻밤에 생긴 친아들</w:t>
+        <w:t>1. 가짜 아빠를 연기하는 왕세자, 그 아이가 하룻밤에 생긴 친아들이라는 정보 비대칭</w:t>
       </w:r>
     </w:p>
     <w:p>
@@ -6660,7 +6675,7 @@
           <w:b w:val="0"/>
           <w:sz w:val="21"/>
         </w:rPr>
-        <w:t>2. 아들을 죽일 수도 있는 병이 바로 왕세자에게서 물려받은 병이라는 아이러니</w:t>
+        <w:t>2. 왕세자에게 아빠라고 외치고 국왕까지 홀리는 뻔뻔한 다섯 살 공범 아들</w:t>
       </w:r>
     </w:p>
     <w:p>
@@ -6675,7 +6690,7 @@
           <w:b w:val="0"/>
           <w:sz w:val="21"/>
         </w:rPr>
-        <w:t>3. 막내 여동생을 세 번이나 팔아넘긴 친오빠 셋, 왕궁에서 기다리는 참교육</w:t>
+        <w:t>3. 핏줄을 증명하려면 피를 흘려야 하는데, 그 피가 멈추지 않는 왕가의 병이라는 아이러니</w:t>
       </w:r>
     </w:p>
     <w:p>
@@ -6690,7 +6705,7 @@
           <w:b w:val="0"/>
           <w:sz w:val="21"/>
         </w:rPr>
-        <w:t>4. 아버지와 오빠 ㅡ&gt; 친오빠 셋 치환, 가족에게 팔린 막내 여동생 서사 강화</w:t>
+        <w:t>4. 아버지와 오빠 ㅡ&gt; 친오빠 셋 치환, 막내 여동생을 세 번 판 오빠들의 참교육</w:t>
       </w:r>
     </w:p>
     <w:p>
@@ -6821,7 +6836,7 @@
           <w:b w:val="0"/>
           <w:sz w:val="21"/>
         </w:rPr>
-        <w:t>릭의 손목을 비틀어 쥔 사람은 줄리언이다. 줄리언이 품에서 꺼낸 약초 가루를 찰리의 무릎에 누르자 피가 단번에 멎고, 줄리언은 로즈에게만 들리게 자기도 같은 병이라고 말한다. 처음 보는 얼굴인데 목소리가 이상하게 귀에 익어 로즈는 대답을 못 한다. 찰리는 삼촌들 앞에서 줄리언 다리에 매달려 우리 아빠가 왔다고 소리친다. 칼이 아비라면 이 꼬마 값을 대신 치르라고 손을 내밀자, 호위가 뽑은 검자루의 왕세자 문장을 본 오빠들이 무릎을 꿇는다. 줄리언이 찰리를 안아 든다. 「내 아들 값은 너희 셋이 광산에서 평생 돌을 캐서 치러라.」</w:t>
+        <w:t>릭의 손목을 비틀어 쥔 사람은, 피 멎는 약초를 구하러 몰래 강 건너 도시에 나온 왕세자 줄리언이다. 줄리언이 품에서 꺼낸 약초 가루를 찰리의 무릎에 꾹 누르자 피가 겨우 멎는다. 줄리언은 로즈에게만 들리게, 자기도 같은 병이라 이 가루를 늘 품고 다니지만 깊이 베인 상처엔 소용이 없다고 말한다. 처음 보는 얼굴인데 목소리가 이상하게 귀에 익어 로즈는 대답을 못 한다. 찰리는 삼촌들 앞에서 줄리언 다리에 매달려 우리 아빠가 왔다고 소리친다. 칼이 아비라면 이 꼬마 값을 대신 치르라고 손을 내밀자, 호위가 뽑은 검자루의 왕세자 문장을 본 오빠들이 무릎을 꿇는다. 줄리언이 찰리를 안아 든다. 「내 아들 값은 너희 셋이 광산에서 평생 돌을 캐서 치러라.」</w:t>
       </w:r>
     </w:p>
     <w:p>
@@ -6950,7 +6965,7 @@
           <w:b w:val="0"/>
           <w:sz w:val="21"/>
         </w:rPr>
-        <w:t>줄리언이 젖은 옷을 갈아입으러 간 사이, 국왕은 두 손주를 왕실 보물 창고로 데려가 마음에 드는 걸 하나씩 고르라고 한다. 맥스는 자기 키만 한 보석 검을 질질 끌다 넘어지고, 헬렌은 맥스에게 딱 맞는 검이라며 손뼉을 친다. 찰리는 금덩이 사이를 지나 벽에 걸린 갈라진 사냥 뿔피리 앞에 선다. 국왕이 젊을 때 사냥터에서 아들들을 부르던 뿔피리라고 하자, 찰리가 국왕을 올려다본다. 「아빠는 한 번도 안 왔어요. 이걸 불면 할아버지는 와 줄 거죠?」</w:t>
+        <w:t>줄리언이 젖은 옷을 갈아입으러 간 사이, 국왕은 두 손주를 왕실 보물 창고로 데려가 마음에 드는 걸 하나씩 고르라고 한다. 맥스는 자기 키만 한 보석 검을 질질 끌다 넘어지고, 헬렌은 맥스에게 딱 맞는 검이라며 손뼉을 친다. 찰리는 금덩이 사이를 지나 벽에 걸린 갈라진 사냥 뿔피리 앞에 선다. 국왕이 젊을 때 사냥터에서 아들들을 부르던 뿔피리라고 하자, 찰리가 국왕을 올려다본다. 「할아버지 집은 너무 커서 길을 잃을 것 같아요. 이걸 불면 할아버지가 찾으러 와 줄 거죠?」</w:t>
       </w:r>
     </w:p>
     <w:p>
@@ -6993,7 +7008,7 @@
           <w:b w:val="0"/>
           <w:sz w:val="21"/>
         </w:rPr>
-        <w:t>그날 밤 그레고리는 헬렌에게, 봄 축제 만찬에서 나라를 세운 첫 왕의 은검으로 찰리를 시험하자고 한다. 왕가의 피가 은검에 닿으면 검에 새긴 글자가 빛나니, 가짜라면 은검은 어두운 채로 남는다는 것이다. 헬렌은 따로 시녀에게 금화 주머니를 들려 성 밖으로 보내 로즈를 아는 사람을 찾게 하고, 그 소문을 듣고 찾아온 사람이 칼이다. 칼은 금화 스무 닢을 받고 로즈는 강가 빨래꾼, 찰리는 아비도 모르는 아이라고 털어놓으며 동생을 세 번째로 판다.</w:t>
+        <w:t>그날 밤 그레고리는 헬렌에게, 봄 축제 만찬에서 나라를 세운 첫 왕의 은검으로 찰리를 시험하자고 한다. 맨손으로 칼날을 쥐어 피를 묻혔을 때 왕가의 피면 검에 새긴 글자가 빛나고, 가짜라면 은검은 어두운 채로 남는다는 것이다. 헬렌은 따로 시녀에게 금화 주머니를 들려 성 밖으로 보내 로즈를 아는 사람을 찾게 하고, 그 소문을 듣고 찾아온 사람이 칼이다. 칼은 금화 스무 닢을 받고 로즈는 강가 빨래꾼, 찰리는 아비도 모르는 아이라고 털어놓으며 동생을 세 번째로 판다.</w:t>
       </w:r>
     </w:p>
     <w:p>
@@ -7050,7 +7065,7 @@
           <w:b w:val="0"/>
           <w:sz w:val="21"/>
         </w:rPr>
-        <w:t>줄리언이 장갑을 벗고 대야 앞에 무릎을 꿇더니, 모두가 보는 앞에서 로즈의 손을 붉은 물에 담가 씻긴다. 「이 손이 내 아들을 혼자 키운 손이다.」 그레고리가 왕세자가 빨래꾼 흉내를 낸다고 소리치자, 꽃 왕관을 쓴 국왕이 일어나 장갑을 벗는다. 국왕은 자기 어머니도 남의 옷을 빨던 손으로 자기를 키웠다며 같은 대야에 손을 넣는다. 「이 물에 손을 못 넣는 자는 내 식탁에 앉지 마라.」 귀족들이 앞다투어 대야에 손을 담그고 줄리언 앞에 고개를 숙이는 사이, 헬렌은 시녀에게 오빠들을 데려오라고 눈짓한다.</w:t>
+        <w:t>줄리언이 장갑을 벗고 대야 앞에 무릎을 꿇더니, 모두가 보는 앞에서 로즈의 손을 붉은 물에 담가 씻긴다. 「이 손이 내 아들을 혼자 키운 손이다.」 그레고리가 왕세자가 빨래꾼 흉내를 낸다고 소리치자, 꽃 왕관을 쓴 국왕이 일어나 장갑을 벗는다. 국왕은 젊어서 전장에 나갔을 때 자기 목숨을 지켜 준 병사들 손도 다 이렇게 갈라져 있었다며 같은 대야에 손을 넣는다. 「이 물에 손을 못 넣는 자는 내 식탁에 앉지 마라.」 귀족들이 앞다투어 대야에 손을 담그고 줄리언 앞에 고개를 숙이는 사이, 헬렌은 시녀에게 오빠들을 데려오라고 눈짓한다.</w:t>
       </w:r>
     </w:p>
     <w:p>
@@ -7079,7 +7094,7 @@
           <w:b w:val="0"/>
           <w:sz w:val="21"/>
         </w:rPr>
-        <w:t>귀족들이 다시 자리에 앉자 헬렌이 국왕 앞에 나서서, 로즈는 귀족 딸이 아니라 강가 빨래꾼이고 찰리는 아비도 모르는 아이라고 말한다. 푸른 드레스도 속아서 한 말이라는 헬렌은, 거짓이면 맥스의 왕위 계승 자격을 내놓겠다고 맹세하고 로즈를 판 오빠 셋이 문밖에 와 있다고 덧붙인다. 국왕이 돌아보자 줄리언은 무릎을 꿇지만, 국왕은 말을 듣기도 전에 줄리언의 왕세자 띠를 끊어 내던진다. 국왕의 명에 근위병들이 로즈와 찰리를 붙잡고, 끌려가던 찰리가 목에 건 뿔피리를 힘껏 불지만, 국왕은 돌아보지 않는다.</w:t>
+        <w:t>귀족들이 다시 자리에 앉자 헬렌이 국왕 앞에 나선다. 로즈는 귀족 딸이 아니라 강가 빨래꾼이고 찰리는 아비도 모르는 아이이며, 푸른 드레스도 자기가 속아서 한 말이라는 것이다. 헬렌은 거짓이면 맥스의 왕위 계승 자격을 내놓겠다고 맹세하고, 로즈를 판 오빠 셋이 문밖에 와 있다고 덧붙인다. 국왕이 찰리가 정말 네 아들이냐고 묻자 줄리언은 무릎을 꿇고 설명하려 하지만, 국왕은 듣지도 않고 줄리언의 왕세자 띠를 끊어 내던진다. 그레고리가 예배당에서 첫 왕의 은검을 가져오고, 맥스가 먼저 칼날을 쥐었다 놓자 피가 묻은 글자가 환하게 빛난다.</w:t>
       </w:r>
     </w:p>
     <w:p>
@@ -7093,7 +7108,7 @@
           <w:b w:val="0"/>
           <w:sz w:val="21"/>
         </w:rPr>
-        <w:t>그레고리가 예배당에서 은검을 가져오자 맥스가 먼저 손끝의 피를 떨어뜨리고, 검에 새긴 글자가 환하게 빛난다. 찰리의 피가 한번 흐르면 멈추지 않는다는 걸 아는 줄리언은, 찰리를 살리려고 자기 아들이 아니라고 자백한다. 찰리가 진짜 자기 아들이라는 걸 모르는 채다. 국왕은 이제 줄리언 말은 못 믿는다며 은검이 가리게 하라고 하고, 근위병이 찰리의 작은 손바닥을 은검 위로 끌어간다. 은검의 날이 찰리의 손바닥에 닿는 순간, 로즈가 소리친다. 「그 애는 피가 안 멈춰요!」</w:t>
+        <w:t>근위병이 찰리를 은검 앞으로 끌고 가자, 찰리는 목에 건 뿔피리를 힘껏 분다. 길을 잃으면 할아버지가 찾으러 와 줄 거라던 그 뿔피리 소리에도 국왕은 고개를 돌린다. 칼날에 베이면 찰리의 피가 멈추지 않는다는 걸 아는 줄리언은, 찰리를 살리려고 찰리는 자기 아들이 아니라고 자백한다. 찰리가 진짜 자기 아들이라는 걸 모르는 채다. 국왕은 이제 줄리언의 말은 하나도 못 믿겠다며 은검이 가리게 하라고 하고, 근위병이 찰리의 작은 손을 펴서 칼날 위로 끌어간다. 날이 손바닥에 닿는 순간, 로즈가 소리친다. 「그 애는 피가 안 멈춰요!」</w:t>
       </w:r>
     </w:p>
     <w:p>

</xml_diff>